<commit_message>
Aggregate all common Dto class in common file
</commit_message>
<xml_diff>
--- a/Documentations/UsefulCommands.docx
+++ b/Documentations/UsefulCommands.docx
@@ -18,7 +18,7 @@
         </w:rPr>
         <w:br/>
       </w:r>
-      <w:bookmarkStart w:id="0" w:name="_Toc206457414"/>
+      <w:bookmarkStart w:id="0" w:name="_Toc206562845"/>
       <w:r>
         <w:rPr>
           <w:rStyle w:val="Heading1Char"/>
@@ -39,11 +39,13 @@
     <w:p>
       <w:pPr>
         <w:pStyle w:val="TOC1"/>
+        <w:bidi w:val="0"/>
         <w:rPr>
           <w:noProof/>
           <w:kern w:val="2"/>
           <w:sz w:val="24"/>
           <w:szCs w:val="24"/>
+          <w:lang w:val="en-IL"/>
         </w:rPr>
       </w:pPr>
       <w:r>
@@ -64,7 +66,7 @@
         </w:rPr>
         <w:fldChar w:fldCharType="separate"/>
       </w:r>
-      <w:hyperlink w:anchor="_Toc206457414" w:history="1">
+      <w:hyperlink w:anchor="_Toc206562845" w:history="1">
         <w:r>
           <w:rPr>
             <w:rStyle w:val="Hyperlink"/>
@@ -110,7 +112,7 @@
             <w:noProof/>
             <w:webHidden/>
           </w:rPr>
-          <w:instrText xml:space="preserve"> PAGEREF _Toc206457414 \h </w:instrText>
+          <w:instrText xml:space="preserve"> PAGEREF _Toc206562845 \h </w:instrText>
         </w:r>
         <w:r>
           <w:rPr>
@@ -147,14 +149,16 @@
         <w:tabs>
           <w:tab w:val="left" w:pos="960"/>
         </w:tabs>
+        <w:bidi w:val="0"/>
         <w:rPr>
           <w:noProof/>
           <w:kern w:val="2"/>
           <w:sz w:val="24"/>
           <w:szCs w:val="24"/>
-        </w:rPr>
-      </w:pPr>
-      <w:hyperlink w:anchor="_Toc206457415" w:history="1">
+          <w:lang w:val="en-IL"/>
+        </w:rPr>
+      </w:pPr>
+      <w:hyperlink w:anchor="_Toc206562846" w:history="1">
         <w:r>
           <w:rPr>
             <w:rStyle w:val="Hyperlink"/>
@@ -170,6 +174,7 @@
             <w:kern w:val="2"/>
             <w:sz w:val="24"/>
             <w:szCs w:val="24"/>
+            <w:lang w:val="en-IL"/>
           </w:rPr>
           <w:tab/>
         </w:r>
@@ -219,7 +224,7 @@
             <w:noProof/>
             <w:webHidden/>
           </w:rPr>
-          <w:instrText xml:space="preserve"> PAGEREF _Toc206457415 \h </w:instrText>
+          <w:instrText xml:space="preserve"> PAGEREF _Toc206562846 \h </w:instrText>
         </w:r>
         <w:r>
           <w:rPr>
@@ -253,14 +258,16 @@
     <w:p>
       <w:pPr>
         <w:pStyle w:val="TOC1"/>
+        <w:bidi w:val="0"/>
         <w:rPr>
           <w:noProof/>
           <w:kern w:val="2"/>
           <w:sz w:val="24"/>
           <w:szCs w:val="24"/>
-        </w:rPr>
-      </w:pPr>
-      <w:hyperlink w:anchor="_Toc206457416" w:history="1">
+          <w:lang w:val="en-IL"/>
+        </w:rPr>
+      </w:pPr>
+      <w:hyperlink w:anchor="_Toc206562847" w:history="1">
         <w:r>
           <w:rPr>
             <w:rStyle w:val="Hyperlink"/>
@@ -451,7 +458,7 @@
             <w:noProof/>
             <w:webHidden/>
           </w:rPr>
-          <w:instrText xml:space="preserve"> PAGEREF _Toc206457416 \h </w:instrText>
+          <w:instrText xml:space="preserve"> PAGEREF _Toc206562847 \h </w:instrText>
         </w:r>
         <w:r>
           <w:rPr>
@@ -485,14 +492,16 @@
     <w:p>
       <w:pPr>
         <w:pStyle w:val="TOC1"/>
+        <w:bidi w:val="0"/>
         <w:rPr>
           <w:noProof/>
           <w:kern w:val="2"/>
           <w:sz w:val="24"/>
           <w:szCs w:val="24"/>
-        </w:rPr>
-      </w:pPr>
-      <w:hyperlink w:anchor="_Toc206457417" w:history="1">
+          <w:lang w:val="en-IL"/>
+        </w:rPr>
+      </w:pPr>
+      <w:hyperlink w:anchor="_Toc206562848" w:history="1">
         <w:r>
           <w:rPr>
             <w:rStyle w:val="Hyperlink"/>
@@ -623,7 +632,7 @@
             <w:noProof/>
             <w:webHidden/>
           </w:rPr>
-          <w:instrText xml:space="preserve"> PAGEREF _Toc206457417 \h </w:instrText>
+          <w:instrText xml:space="preserve"> PAGEREF _Toc206562848 \h </w:instrText>
         </w:r>
         <w:r>
           <w:rPr>
@@ -657,14 +666,16 @@
     <w:p>
       <w:pPr>
         <w:pStyle w:val="TOC1"/>
+        <w:bidi w:val="0"/>
         <w:rPr>
           <w:noProof/>
           <w:kern w:val="2"/>
           <w:sz w:val="24"/>
           <w:szCs w:val="24"/>
-        </w:rPr>
-      </w:pPr>
-      <w:hyperlink w:anchor="_Toc206457418" w:history="1">
+          <w:lang w:val="en-IL"/>
+        </w:rPr>
+      </w:pPr>
+      <w:hyperlink w:anchor="_Toc206562849" w:history="1">
         <w:r>
           <w:rPr>
             <w:rStyle w:val="Hyperlink"/>
@@ -749,7 +760,7 @@
             <w:noProof/>
             <w:webHidden/>
           </w:rPr>
-          <w:instrText xml:space="preserve"> PAGEREF _Toc206457418 \h </w:instrText>
+          <w:instrText xml:space="preserve"> PAGEREF _Toc206562849 \h </w:instrText>
         </w:r>
         <w:r>
           <w:rPr>
@@ -784,22 +795,23 @@
       <w:pPr>
         <w:pStyle w:val="TOC1"/>
         <w:tabs>
-          <w:tab w:val="left" w:pos="960"/>
-        </w:tabs>
+          <w:tab w:val="left" w:pos="2914"/>
+        </w:tabs>
+        <w:bidi w:val="0"/>
         <w:rPr>
           <w:noProof/>
           <w:kern w:val="2"/>
           <w:sz w:val="24"/>
           <w:szCs w:val="24"/>
-        </w:rPr>
-      </w:pPr>
-      <w:hyperlink w:anchor="_Toc206457419" w:history="1">
+          <w:lang w:val="en-IL"/>
+        </w:rPr>
+      </w:pPr>
+      <w:hyperlink w:anchor="_Toc206562850" w:history="1">
         <w:r>
           <w:rPr>
             <w:rStyle w:val="Hyperlink"/>
             <w:noProof/>
             <w:rtl/>
-            <w:lang w:val="en-US"/>
           </w:rPr>
           <w:t>2.</w:t>
         </w:r>
@@ -809,6 +821,7 @@
             <w:kern w:val="2"/>
             <w:sz w:val="24"/>
             <w:szCs w:val="24"/>
+            <w:lang w:val="en-IL"/>
           </w:rPr>
           <w:tab/>
         </w:r>
@@ -818,26 +831,59 @@
             <w:rFonts w:hint="cs"/>
             <w:noProof/>
             <w:rtl/>
-            <w:lang w:val="en-US"/>
-          </w:rPr>
-          <w:t>פקודות</w:t>
+          </w:rPr>
+          <w:t>דיאגנוסטיקה</w:t>
         </w:r>
         <w:r>
           <w:rPr>
             <w:rStyle w:val="Hyperlink"/>
             <w:noProof/>
             <w:rtl/>
-            <w:lang w:val="en-US"/>
           </w:rPr>
           <w:t xml:space="preserve"> </w:t>
         </w:r>
         <w:r>
           <w:rPr>
             <w:rStyle w:val="Hyperlink"/>
-            <w:noProof/>
-            <w:lang w:val="en-US"/>
-          </w:rPr>
-          <w:t>Entity Framework</w:t>
+            <w:rFonts w:hint="cs"/>
+            <w:noProof/>
+            <w:rtl/>
+          </w:rPr>
+          <w:t>על</w:t>
+        </w:r>
+        <w:r>
+          <w:rPr>
+            <w:rStyle w:val="Hyperlink"/>
+            <w:noProof/>
+            <w:rtl/>
+          </w:rPr>
+          <w:t xml:space="preserve"> </w:t>
+        </w:r>
+        <w:r>
+          <w:rPr>
+            <w:rStyle w:val="Hyperlink"/>
+            <w:rFonts w:hint="cs"/>
+            <w:noProof/>
+            <w:rtl/>
+          </w:rPr>
+          <w:t>חיבור</w:t>
+        </w:r>
+        <w:r>
+          <w:rPr>
+            <w:rStyle w:val="Hyperlink"/>
+            <w:noProof/>
+            <w:rtl/>
+          </w:rPr>
+          <w:t xml:space="preserve"> </w:t>
+        </w:r>
+        <w:r>
+          <w:rPr>
+            <w:rStyle w:val="Hyperlink"/>
+            <w:rFonts w:hint="cs"/>
+            <w:noProof/>
+            <w:rtl/>
+          </w:rPr>
+          <w:t>תקשורת</w:t>
         </w:r>
         <w:r>
           <w:rPr>
@@ -858,7 +904,7 @@
             <w:noProof/>
             <w:webHidden/>
           </w:rPr>
-          <w:instrText xml:space="preserve"> PAGEREF _Toc206457419 \h </w:instrText>
+          <w:instrText xml:space="preserve"> PAGEREF _Toc206562850 \h </w:instrText>
         </w:r>
         <w:r>
           <w:rPr>
@@ -891,182 +937,25 @@
     </w:p>
     <w:p>
       <w:pPr>
-        <w:pStyle w:val="TOC2"/>
-        <w:tabs>
-          <w:tab w:val="right" w:leader="dot" w:pos="9016"/>
-        </w:tabs>
-        <w:bidi/>
+        <w:pStyle w:val="TOC1"/>
+        <w:tabs>
+          <w:tab w:val="left" w:pos="960"/>
+        </w:tabs>
+        <w:bidi w:val="0"/>
         <w:rPr>
           <w:noProof/>
           <w:kern w:val="2"/>
           <w:sz w:val="24"/>
           <w:szCs w:val="24"/>
-        </w:rPr>
-      </w:pPr>
-      <w:hyperlink w:anchor="_Toc206457420" w:history="1">
+          <w:lang w:val="en-IL"/>
+        </w:rPr>
+      </w:pPr>
+      <w:hyperlink w:anchor="_Toc206562851" w:history="1">
         <w:r>
           <w:rPr>
             <w:rStyle w:val="Hyperlink"/>
-            <w:rFonts w:ascii="Segoe UI Emoji" w:hAnsi="Segoe UI Emoji" w:cs="Segoe UI Emoji"/>
-            <w:noProof/>
-          </w:rPr>
-          <w:t>🚀</w:t>
-        </w:r>
-        <w:r>
-          <w:rPr>
-            <w:rStyle w:val="Hyperlink"/>
-            <w:noProof/>
-          </w:rPr>
-          <w:t xml:space="preserve"> </w:t>
-        </w:r>
-        <w:r>
-          <w:rPr>
-            <w:rStyle w:val="Hyperlink"/>
-            <w:rFonts w:hint="cs"/>
             <w:noProof/>
             <w:rtl/>
-            <w:lang w:val="en-US"/>
-          </w:rPr>
-          <w:t>התקנת</w:t>
-        </w:r>
-        <w:r>
-          <w:rPr>
-            <w:rStyle w:val="Hyperlink"/>
-            <w:noProof/>
-            <w:lang w:val="en-US"/>
-          </w:rPr>
-          <w:t>)</w:t>
-        </w:r>
-        <w:r>
-          <w:rPr>
-            <w:rStyle w:val="Hyperlink"/>
-            <w:noProof/>
-          </w:rPr>
-          <w:t xml:space="preserve"> EF CLI </w:t>
-        </w:r>
-        <w:r>
-          <w:rPr>
-            <w:rStyle w:val="Hyperlink"/>
-            <w:rFonts w:hint="cs"/>
-            <w:noProof/>
-            <w:rtl/>
-            <w:lang w:val="en-US"/>
-          </w:rPr>
-          <w:t>אם</w:t>
-        </w:r>
-        <w:r>
-          <w:rPr>
-            <w:rStyle w:val="Hyperlink"/>
-            <w:noProof/>
-            <w:rtl/>
-            <w:lang w:val="en-US"/>
-          </w:rPr>
-          <w:t xml:space="preserve"> </w:t>
-        </w:r>
-        <w:r>
-          <w:rPr>
-            <w:rStyle w:val="Hyperlink"/>
-            <w:rFonts w:hint="cs"/>
-            <w:noProof/>
-            <w:rtl/>
-            <w:lang w:val="en-US"/>
-          </w:rPr>
-          <w:t>לא</w:t>
-        </w:r>
-        <w:r>
-          <w:rPr>
-            <w:rStyle w:val="Hyperlink"/>
-            <w:noProof/>
-            <w:rtl/>
-            <w:lang w:val="en-US"/>
-          </w:rPr>
-          <w:t xml:space="preserve"> </w:t>
-        </w:r>
-        <w:r>
-          <w:rPr>
-            <w:rStyle w:val="Hyperlink"/>
-            <w:rFonts w:hint="cs"/>
-            <w:noProof/>
-            <w:rtl/>
-            <w:lang w:val="en-US"/>
-          </w:rPr>
-          <w:t>מותקן</w:t>
-        </w:r>
-        <w:r>
-          <w:rPr>
-            <w:rStyle w:val="Hyperlink"/>
-            <w:noProof/>
-          </w:rPr>
-          <w:t xml:space="preserve"> (</w:t>
-        </w:r>
-        <w:r>
-          <w:rPr>
-            <w:noProof/>
-            <w:webHidden/>
-          </w:rPr>
-          <w:tab/>
-        </w:r>
-        <w:r>
-          <w:rPr>
-            <w:noProof/>
-            <w:webHidden/>
-          </w:rPr>
-          <w:fldChar w:fldCharType="begin"/>
-        </w:r>
-        <w:r>
-          <w:rPr>
-            <w:noProof/>
-            <w:webHidden/>
-          </w:rPr>
-          <w:instrText xml:space="preserve"> PAGEREF _Toc206457420 \h </w:instrText>
-        </w:r>
-        <w:r>
-          <w:rPr>
-            <w:noProof/>
-            <w:webHidden/>
-          </w:rPr>
-        </w:r>
-        <w:r>
-          <w:rPr>
-            <w:noProof/>
-            <w:webHidden/>
-          </w:rPr>
-          <w:fldChar w:fldCharType="separate"/>
-        </w:r>
-        <w:r>
-          <w:rPr>
-            <w:noProof/>
-            <w:webHidden/>
-          </w:rPr>
-          <w:t>4</w:t>
-        </w:r>
-        <w:r>
-          <w:rPr>
-            <w:noProof/>
-            <w:webHidden/>
-          </w:rPr>
-          <w:fldChar w:fldCharType="end"/>
-        </w:r>
-      </w:hyperlink>
-    </w:p>
-    <w:p>
-      <w:pPr>
-        <w:pStyle w:val="TOC1"/>
-        <w:tabs>
-          <w:tab w:val="left" w:pos="2332"/>
-        </w:tabs>
-        <w:rPr>
-          <w:noProof/>
-          <w:kern w:val="2"/>
-          <w:sz w:val="24"/>
-          <w:szCs w:val="24"/>
-        </w:rPr>
-      </w:pPr>
-      <w:hyperlink w:anchor="_Toc206457421" w:history="1">
-        <w:r>
-          <w:rPr>
-            <w:rStyle w:val="Hyperlink"/>
-            <w:noProof/>
             <w:lang w:val="en-US"/>
           </w:rPr>
           <w:t>3.</w:t>
@@ -1077,6 +966,7 @@
             <w:kern w:val="2"/>
             <w:sz w:val="24"/>
             <w:szCs w:val="24"/>
+            <w:lang w:val="en-IL"/>
           </w:rPr>
           <w:tab/>
         </w:r>
@@ -1102,20 +992,133 @@
         <w:r>
           <w:rPr>
             <w:rStyle w:val="Hyperlink"/>
+            <w:noProof/>
+            <w:lang w:val="en-US"/>
+          </w:rPr>
+          <w:t>Entity Framework</w:t>
+        </w:r>
+        <w:r>
+          <w:rPr>
+            <w:noProof/>
+            <w:webHidden/>
+          </w:rPr>
+          <w:tab/>
+        </w:r>
+        <w:r>
+          <w:rPr>
+            <w:noProof/>
+            <w:webHidden/>
+          </w:rPr>
+          <w:fldChar w:fldCharType="begin"/>
+        </w:r>
+        <w:r>
+          <w:rPr>
+            <w:noProof/>
+            <w:webHidden/>
+          </w:rPr>
+          <w:instrText xml:space="preserve"> PAGEREF _Toc206562851 \h </w:instrText>
+        </w:r>
+        <w:r>
+          <w:rPr>
+            <w:noProof/>
+            <w:webHidden/>
+          </w:rPr>
+        </w:r>
+        <w:r>
+          <w:rPr>
+            <w:noProof/>
+            <w:webHidden/>
+          </w:rPr>
+          <w:fldChar w:fldCharType="separate"/>
+        </w:r>
+        <w:r>
+          <w:rPr>
+            <w:noProof/>
+            <w:webHidden/>
+          </w:rPr>
+          <w:t>4</w:t>
+        </w:r>
+        <w:r>
+          <w:rPr>
+            <w:noProof/>
+            <w:webHidden/>
+          </w:rPr>
+          <w:fldChar w:fldCharType="end"/>
+        </w:r>
+      </w:hyperlink>
+    </w:p>
+    <w:p>
+      <w:pPr>
+        <w:pStyle w:val="TOC2"/>
+        <w:tabs>
+          <w:tab w:val="right" w:leader="dot" w:pos="9016"/>
+        </w:tabs>
+        <w:rPr>
+          <w:noProof/>
+          <w:kern w:val="2"/>
+          <w:sz w:val="24"/>
+          <w:szCs w:val="24"/>
+          <w:lang w:val="en-IL"/>
+        </w:rPr>
+      </w:pPr>
+      <w:hyperlink w:anchor="_Toc206562852" w:history="1">
+        <w:r>
+          <w:rPr>
+            <w:rStyle w:val="Hyperlink"/>
+            <w:rFonts w:ascii="Segoe UI Emoji" w:hAnsi="Segoe UI Emoji" w:cs="Segoe UI Emoji"/>
+            <w:noProof/>
+          </w:rPr>
+          <w:t>🚀</w:t>
+        </w:r>
+        <w:r>
+          <w:rPr>
+            <w:rStyle w:val="Hyperlink"/>
+            <w:noProof/>
+          </w:rPr>
+          <w:t xml:space="preserve"> </w:t>
+        </w:r>
+        <w:r>
+          <w:rPr>
+            <w:rStyle w:val="Hyperlink"/>
             <w:rFonts w:hint="cs"/>
             <w:noProof/>
             <w:rtl/>
             <w:lang w:val="en-US"/>
           </w:rPr>
-          <w:t>לדוקר</w:t>
+          <w:t>התקנת</w:t>
         </w:r>
         <w:r>
           <w:rPr>
             <w:rStyle w:val="Hyperlink"/>
+            <w:noProof/>
+            <w:lang w:val="en-US"/>
+          </w:rPr>
+          <w:t>)</w:t>
+        </w:r>
+        <w:r>
+          <w:rPr>
+            <w:rStyle w:val="Hyperlink"/>
+            <w:noProof/>
+          </w:rPr>
+          <w:t xml:space="preserve"> EF CLI </w:t>
+        </w:r>
+        <w:r>
+          <w:rPr>
+            <w:rStyle w:val="Hyperlink"/>
+            <w:rFonts w:hint="cs"/>
             <w:noProof/>
             <w:rtl/>
             <w:lang w:val="en-US"/>
           </w:rPr>
+          <w:t>אם</w:t>
+        </w:r>
+        <w:r>
+          <w:rPr>
+            <w:rStyle w:val="Hyperlink"/>
+            <w:noProof/>
+            <w:rtl/>
+            <w:lang w:val="en-US"/>
+          </w:rPr>
           <w:t xml:space="preserve"> </w:t>
         </w:r>
         <w:r>
@@ -1126,7 +1129,33 @@
             <w:rtl/>
             <w:lang w:val="en-US"/>
           </w:rPr>
-          <w:t>קונטיינר</w:t>
+          <w:t>לא</w:t>
+        </w:r>
+        <w:r>
+          <w:rPr>
+            <w:rStyle w:val="Hyperlink"/>
+            <w:noProof/>
+            <w:rtl/>
+            <w:lang w:val="en-US"/>
+          </w:rPr>
+          <w:t xml:space="preserve"> </w:t>
+        </w:r>
+        <w:r>
+          <w:rPr>
+            <w:rStyle w:val="Hyperlink"/>
+            <w:rFonts w:hint="cs"/>
+            <w:noProof/>
+            <w:rtl/>
+            <w:lang w:val="en-US"/>
+          </w:rPr>
+          <w:t>מותקן</w:t>
+        </w:r>
+        <w:r>
+          <w:rPr>
+            <w:rStyle w:val="Hyperlink"/>
+            <w:noProof/>
+          </w:rPr>
+          <w:t xml:space="preserve"> (</w:t>
         </w:r>
         <w:r>
           <w:rPr>
@@ -1147,7 +1176,7 @@
             <w:noProof/>
             <w:webHidden/>
           </w:rPr>
-          <w:instrText xml:space="preserve"> PAGEREF _Toc206457421 \h </w:instrText>
+          <w:instrText xml:space="preserve"> PAGEREF _Toc206562852 \h </w:instrText>
         </w:r>
         <w:r>
           <w:rPr>
@@ -1184,20 +1213,21 @@
         <w:tabs>
           <w:tab w:val="left" w:pos="1680"/>
         </w:tabs>
+        <w:bidi w:val="0"/>
         <w:rPr>
           <w:noProof/>
           <w:kern w:val="2"/>
           <w:sz w:val="24"/>
           <w:szCs w:val="24"/>
-        </w:rPr>
-      </w:pPr>
-      <w:hyperlink w:anchor="_Toc206457422" w:history="1">
+          <w:lang w:val="en-IL"/>
+        </w:rPr>
+      </w:pPr>
+      <w:hyperlink w:anchor="_Toc206562853" w:history="1">
         <w:r>
           <w:rPr>
             <w:rStyle w:val="Hyperlink"/>
             <w:noProof/>
             <w:rtl/>
-            <w:lang w:val="en-US"/>
           </w:rPr>
           <w:t>4.</w:t>
         </w:r>
@@ -1207,6 +1237,7 @@
             <w:kern w:val="2"/>
             <w:sz w:val="24"/>
             <w:szCs w:val="24"/>
+            <w:lang w:val="en-IL"/>
           </w:rPr>
           <w:tab/>
         </w:r>
@@ -1217,7 +1248,7 @@
             <w:noProof/>
             <w:rtl/>
           </w:rPr>
-          <w:t>התקנת</w:t>
+          <w:t>מהו</w:t>
         </w:r>
         <w:r>
           <w:rPr>
@@ -1234,22 +1265,7 @@
             <w:noProof/>
             <w:rtl/>
           </w:rPr>
-          <w:t>סביבת</w:t>
-        </w:r>
-        <w:r>
-          <w:rPr>
-            <w:rStyle w:val="Hyperlink"/>
-            <w:noProof/>
-            <w:rtl/>
-          </w:rPr>
-          <w:t xml:space="preserve"> </w:t>
-        </w:r>
-        <w:r>
-          <w:rPr>
-            <w:rStyle w:val="Hyperlink"/>
-            <w:noProof/>
-          </w:rPr>
-          <w:t xml:space="preserve">React </w:t>
+          <w:t>קובץ</w:t>
         </w:r>
         <w:r>
           <w:rPr>
@@ -1266,7 +1282,7 @@
             <w:noProof/>
             <w:rtl/>
           </w:rPr>
-          <w:t>ראשונה</w:t>
+          <w:t>הדוקר</w:t>
         </w:r>
         <w:r>
           <w:rPr>
@@ -1275,6 +1291,97 @@
             <w:rtl/>
           </w:rPr>
           <w:t xml:space="preserve"> </w:t>
+        </w:r>
+        <w:r>
+          <w:rPr>
+            <w:rStyle w:val="Hyperlink"/>
+            <w:noProof/>
+          </w:rPr>
+          <w:t>Dockerfile</w:t>
+        </w:r>
+        <w:r>
+          <w:rPr>
+            <w:noProof/>
+            <w:webHidden/>
+          </w:rPr>
+          <w:tab/>
+        </w:r>
+        <w:r>
+          <w:rPr>
+            <w:noProof/>
+            <w:webHidden/>
+          </w:rPr>
+          <w:fldChar w:fldCharType="begin"/>
+        </w:r>
+        <w:r>
+          <w:rPr>
+            <w:noProof/>
+            <w:webHidden/>
+          </w:rPr>
+          <w:instrText xml:space="preserve"> PAGEREF _Toc206562853 \h </w:instrText>
+        </w:r>
+        <w:r>
+          <w:rPr>
+            <w:noProof/>
+            <w:webHidden/>
+          </w:rPr>
+        </w:r>
+        <w:r>
+          <w:rPr>
+            <w:noProof/>
+            <w:webHidden/>
+          </w:rPr>
+          <w:fldChar w:fldCharType="separate"/>
+        </w:r>
+        <w:r>
+          <w:rPr>
+            <w:noProof/>
+            <w:webHidden/>
+          </w:rPr>
+          <w:t>5</w:t>
+        </w:r>
+        <w:r>
+          <w:rPr>
+            <w:noProof/>
+            <w:webHidden/>
+          </w:rPr>
+          <w:fldChar w:fldCharType="end"/>
+        </w:r>
+      </w:hyperlink>
+    </w:p>
+    <w:p>
+      <w:pPr>
+        <w:pStyle w:val="TOC1"/>
+        <w:tabs>
+          <w:tab w:val="left" w:pos="2494"/>
+        </w:tabs>
+        <w:bidi w:val="0"/>
+        <w:rPr>
+          <w:noProof/>
+          <w:kern w:val="2"/>
+          <w:sz w:val="24"/>
+          <w:szCs w:val="24"/>
+          <w:lang w:val="en-IL"/>
+        </w:rPr>
+      </w:pPr>
+      <w:hyperlink w:anchor="_Toc206562854" w:history="1">
+        <w:r>
+          <w:rPr>
+            <w:rStyle w:val="Hyperlink"/>
+            <w:noProof/>
+            <w:lang w:val="en-US"/>
+          </w:rPr>
+          <w:t>5.</w:t>
+        </w:r>
+        <w:r>
+          <w:rPr>
+            <w:noProof/>
+            <w:kern w:val="2"/>
+            <w:sz w:val="24"/>
+            <w:szCs w:val="24"/>
+            <w:lang w:val="en-IL"/>
+          </w:rPr>
+          <w:tab/>
         </w:r>
         <w:r>
           <w:rPr>
@@ -1282,6 +1389,507 @@
             <w:rFonts w:hint="cs"/>
             <w:noProof/>
             <w:rtl/>
+            <w:lang w:val="en-US"/>
+          </w:rPr>
+          <w:t>מהו</w:t>
+        </w:r>
+        <w:r>
+          <w:rPr>
+            <w:rStyle w:val="Hyperlink"/>
+            <w:noProof/>
+            <w:rtl/>
+            <w:lang w:val="en-US"/>
+          </w:rPr>
+          <w:t xml:space="preserve"> </w:t>
+        </w:r>
+        <w:r>
+          <w:rPr>
+            <w:rStyle w:val="Hyperlink"/>
+            <w:rFonts w:hint="cs"/>
+            <w:noProof/>
+            <w:rtl/>
+            <w:lang w:val="en-US"/>
+          </w:rPr>
+          <w:t>קובץ</w:t>
+        </w:r>
+        <w:r>
+          <w:rPr>
+            <w:rStyle w:val="Hyperlink"/>
+            <w:noProof/>
+            <w:rtl/>
+            <w:lang w:val="en-US"/>
+          </w:rPr>
+          <w:t xml:space="preserve"> </w:t>
+        </w:r>
+        <w:r>
+          <w:rPr>
+            <w:rStyle w:val="Hyperlink"/>
+            <w:rFonts w:hint="cs"/>
+            <w:noProof/>
+            <w:rtl/>
+            <w:lang w:val="en-US"/>
+          </w:rPr>
+          <w:t>הדוקר</w:t>
+        </w:r>
+        <w:r>
+          <w:rPr>
+            <w:rStyle w:val="Hyperlink"/>
+            <w:noProof/>
+            <w:rtl/>
+            <w:lang w:val="en-US"/>
+          </w:rPr>
+          <w:t>-</w:t>
+        </w:r>
+        <w:r>
+          <w:rPr>
+            <w:rStyle w:val="Hyperlink"/>
+            <w:rFonts w:hint="cs"/>
+            <w:noProof/>
+            <w:rtl/>
+            <w:lang w:val="en-US"/>
+          </w:rPr>
+          <w:t>קומפוז</w:t>
+        </w:r>
+        <w:r>
+          <w:rPr>
+            <w:rStyle w:val="Hyperlink"/>
+            <w:noProof/>
+            <w:rtl/>
+            <w:lang w:val="en-US"/>
+          </w:rPr>
+          <w:t xml:space="preserve"> </w:t>
+        </w:r>
+        <w:r>
+          <w:rPr>
+            <w:rStyle w:val="Hyperlink"/>
+            <w:noProof/>
+            <w:lang w:val="en-US"/>
+          </w:rPr>
+          <w:t>docker-compose.yml</w:t>
+        </w:r>
+        <w:r>
+          <w:rPr>
+            <w:noProof/>
+            <w:webHidden/>
+          </w:rPr>
+          <w:tab/>
+        </w:r>
+        <w:r>
+          <w:rPr>
+            <w:noProof/>
+            <w:webHidden/>
+          </w:rPr>
+          <w:fldChar w:fldCharType="begin"/>
+        </w:r>
+        <w:r>
+          <w:rPr>
+            <w:noProof/>
+            <w:webHidden/>
+          </w:rPr>
+          <w:instrText xml:space="preserve"> PAGEREF _Toc206562854 \h </w:instrText>
+        </w:r>
+        <w:r>
+          <w:rPr>
+            <w:noProof/>
+            <w:webHidden/>
+          </w:rPr>
+        </w:r>
+        <w:r>
+          <w:rPr>
+            <w:noProof/>
+            <w:webHidden/>
+          </w:rPr>
+          <w:fldChar w:fldCharType="separate"/>
+        </w:r>
+        <w:r>
+          <w:rPr>
+            <w:noProof/>
+            <w:webHidden/>
+          </w:rPr>
+          <w:t>5</w:t>
+        </w:r>
+        <w:r>
+          <w:rPr>
+            <w:noProof/>
+            <w:webHidden/>
+          </w:rPr>
+          <w:fldChar w:fldCharType="end"/>
+        </w:r>
+      </w:hyperlink>
+    </w:p>
+    <w:p>
+      <w:pPr>
+        <w:pStyle w:val="TOC1"/>
+        <w:tabs>
+          <w:tab w:val="left" w:pos="2152"/>
+        </w:tabs>
+        <w:bidi w:val="0"/>
+        <w:rPr>
+          <w:noProof/>
+          <w:kern w:val="2"/>
+          <w:sz w:val="24"/>
+          <w:szCs w:val="24"/>
+          <w:lang w:val="en-IL"/>
+        </w:rPr>
+      </w:pPr>
+      <w:hyperlink w:anchor="_Toc206562855" w:history="1">
+        <w:r>
+          <w:rPr>
+            <w:rStyle w:val="Hyperlink"/>
+            <w:noProof/>
+            <w:rtl/>
+            <w:lang w:val="en-US"/>
+          </w:rPr>
+          <w:t>6.</w:t>
+        </w:r>
+        <w:r>
+          <w:rPr>
+            <w:noProof/>
+            <w:kern w:val="2"/>
+            <w:sz w:val="24"/>
+            <w:szCs w:val="24"/>
+            <w:lang w:val="en-IL"/>
+          </w:rPr>
+          <w:tab/>
+        </w:r>
+        <w:r>
+          <w:rPr>
+            <w:rStyle w:val="Hyperlink"/>
+            <w:rFonts w:hint="cs"/>
+            <w:noProof/>
+            <w:rtl/>
+            <w:lang w:val="en-US"/>
+          </w:rPr>
+          <w:t>פקודות</w:t>
+        </w:r>
+        <w:r>
+          <w:rPr>
+            <w:rStyle w:val="Hyperlink"/>
+            <w:noProof/>
+            <w:rtl/>
+            <w:lang w:val="en-US"/>
+          </w:rPr>
+          <w:t xml:space="preserve"> </w:t>
+        </w:r>
+        <w:r>
+          <w:rPr>
+            <w:rStyle w:val="Hyperlink"/>
+            <w:rFonts w:hint="cs"/>
+            <w:noProof/>
+            <w:rtl/>
+            <w:lang w:val="en-US"/>
+          </w:rPr>
+          <w:t>לדוקר</w:t>
+        </w:r>
+        <w:r>
+          <w:rPr>
+            <w:rStyle w:val="Hyperlink"/>
+            <w:noProof/>
+            <w:rtl/>
+            <w:lang w:val="en-US"/>
+          </w:rPr>
+          <w:t xml:space="preserve"> </w:t>
+        </w:r>
+        <w:r>
+          <w:rPr>
+            <w:rStyle w:val="Hyperlink"/>
+            <w:rFonts w:hint="cs"/>
+            <w:noProof/>
+            <w:rtl/>
+            <w:lang w:val="en-US"/>
+          </w:rPr>
+          <w:t>קונטיינר</w:t>
+        </w:r>
+        <w:r>
+          <w:rPr>
+            <w:noProof/>
+            <w:webHidden/>
+          </w:rPr>
+          <w:tab/>
+        </w:r>
+        <w:r>
+          <w:rPr>
+            <w:noProof/>
+            <w:webHidden/>
+          </w:rPr>
+          <w:fldChar w:fldCharType="begin"/>
+        </w:r>
+        <w:r>
+          <w:rPr>
+            <w:noProof/>
+            <w:webHidden/>
+          </w:rPr>
+          <w:instrText xml:space="preserve"> PAGEREF _Toc206562855 \h </w:instrText>
+        </w:r>
+        <w:r>
+          <w:rPr>
+            <w:noProof/>
+            <w:webHidden/>
+          </w:rPr>
+        </w:r>
+        <w:r>
+          <w:rPr>
+            <w:noProof/>
+            <w:webHidden/>
+          </w:rPr>
+          <w:fldChar w:fldCharType="separate"/>
+        </w:r>
+        <w:r>
+          <w:rPr>
+            <w:noProof/>
+            <w:webHidden/>
+          </w:rPr>
+          <w:t>7</w:t>
+        </w:r>
+        <w:r>
+          <w:rPr>
+            <w:noProof/>
+            <w:webHidden/>
+          </w:rPr>
+          <w:fldChar w:fldCharType="end"/>
+        </w:r>
+      </w:hyperlink>
+    </w:p>
+    <w:p>
+      <w:pPr>
+        <w:pStyle w:val="TOC1"/>
+        <w:tabs>
+          <w:tab w:val="left" w:pos="1920"/>
+        </w:tabs>
+        <w:bidi w:val="0"/>
+        <w:rPr>
+          <w:noProof/>
+          <w:kern w:val="2"/>
+          <w:sz w:val="24"/>
+          <w:szCs w:val="24"/>
+          <w:lang w:val="en-IL"/>
+        </w:rPr>
+      </w:pPr>
+      <w:hyperlink w:anchor="_Toc206562856" w:history="1">
+        <w:r>
+          <w:rPr>
+            <w:rStyle w:val="Hyperlink"/>
+            <w:noProof/>
+            <w:rtl/>
+            <w:lang w:val="en-US"/>
+          </w:rPr>
+          <w:t>7.</w:t>
+        </w:r>
+        <w:r>
+          <w:rPr>
+            <w:noProof/>
+            <w:kern w:val="2"/>
+            <w:sz w:val="24"/>
+            <w:szCs w:val="24"/>
+            <w:lang w:val="en-IL"/>
+          </w:rPr>
+          <w:tab/>
+        </w:r>
+        <w:r>
+          <w:rPr>
+            <w:rStyle w:val="Hyperlink"/>
+            <w:rFonts w:hint="cs"/>
+            <w:noProof/>
+            <w:rtl/>
+            <w:lang w:val="en-US"/>
+          </w:rPr>
+          <w:t>פקודות</w:t>
+        </w:r>
+        <w:r>
+          <w:rPr>
+            <w:rStyle w:val="Hyperlink"/>
+            <w:noProof/>
+            <w:rtl/>
+            <w:lang w:val="en-US"/>
+          </w:rPr>
+          <w:t xml:space="preserve"> </w:t>
+        </w:r>
+        <w:r>
+          <w:rPr>
+            <w:rStyle w:val="Hyperlink"/>
+            <w:rFonts w:hint="cs"/>
+            <w:noProof/>
+            <w:rtl/>
+            <w:lang w:val="en-US"/>
+          </w:rPr>
+          <w:t>קובץ</w:t>
+        </w:r>
+        <w:r>
+          <w:rPr>
+            <w:rStyle w:val="Hyperlink"/>
+            <w:noProof/>
+            <w:rtl/>
+            <w:lang w:val="en-US"/>
+          </w:rPr>
+          <w:t xml:space="preserve"> </w:t>
+        </w:r>
+        <w:r>
+          <w:rPr>
+            <w:rStyle w:val="Hyperlink"/>
+            <w:rFonts w:hint="cs"/>
+            <w:noProof/>
+            <w:rtl/>
+            <w:lang w:val="en-US"/>
+          </w:rPr>
+          <w:t>הדוקר</w:t>
+        </w:r>
+        <w:r>
+          <w:rPr>
+            <w:noProof/>
+            <w:webHidden/>
+          </w:rPr>
+          <w:tab/>
+        </w:r>
+        <w:r>
+          <w:rPr>
+            <w:noProof/>
+            <w:webHidden/>
+          </w:rPr>
+          <w:fldChar w:fldCharType="begin"/>
+        </w:r>
+        <w:r>
+          <w:rPr>
+            <w:noProof/>
+            <w:webHidden/>
+          </w:rPr>
+          <w:instrText xml:space="preserve"> PAGEREF _Toc206562856 \h </w:instrText>
+        </w:r>
+        <w:r>
+          <w:rPr>
+            <w:noProof/>
+            <w:webHidden/>
+          </w:rPr>
+        </w:r>
+        <w:r>
+          <w:rPr>
+            <w:noProof/>
+            <w:webHidden/>
+          </w:rPr>
+          <w:fldChar w:fldCharType="separate"/>
+        </w:r>
+        <w:r>
+          <w:rPr>
+            <w:noProof/>
+            <w:webHidden/>
+          </w:rPr>
+          <w:t>8</w:t>
+        </w:r>
+        <w:r>
+          <w:rPr>
+            <w:noProof/>
+            <w:webHidden/>
+          </w:rPr>
+          <w:fldChar w:fldCharType="end"/>
+        </w:r>
+      </w:hyperlink>
+    </w:p>
+    <w:p>
+      <w:pPr>
+        <w:pStyle w:val="TOC1"/>
+        <w:tabs>
+          <w:tab w:val="left" w:pos="1680"/>
+        </w:tabs>
+        <w:bidi w:val="0"/>
+        <w:rPr>
+          <w:noProof/>
+          <w:kern w:val="2"/>
+          <w:sz w:val="24"/>
+          <w:szCs w:val="24"/>
+          <w:lang w:val="en-IL"/>
+        </w:rPr>
+      </w:pPr>
+      <w:hyperlink w:anchor="_Toc206562857" w:history="1">
+        <w:r>
+          <w:rPr>
+            <w:rStyle w:val="Hyperlink"/>
+            <w:noProof/>
+            <w:rtl/>
+            <w:lang w:val="en-US"/>
+          </w:rPr>
+          <w:t>8.</w:t>
+        </w:r>
+        <w:r>
+          <w:rPr>
+            <w:noProof/>
+            <w:kern w:val="2"/>
+            <w:sz w:val="24"/>
+            <w:szCs w:val="24"/>
+            <w:lang w:val="en-IL"/>
+          </w:rPr>
+          <w:tab/>
+        </w:r>
+        <w:r>
+          <w:rPr>
+            <w:rStyle w:val="Hyperlink"/>
+            <w:rFonts w:hint="cs"/>
+            <w:noProof/>
+            <w:rtl/>
+          </w:rPr>
+          <w:t>התקנת</w:t>
+        </w:r>
+        <w:r>
+          <w:rPr>
+            <w:rStyle w:val="Hyperlink"/>
+            <w:noProof/>
+            <w:rtl/>
+          </w:rPr>
+          <w:t xml:space="preserve"> </w:t>
+        </w:r>
+        <w:r>
+          <w:rPr>
+            <w:rStyle w:val="Hyperlink"/>
+            <w:rFonts w:hint="cs"/>
+            <w:noProof/>
+            <w:rtl/>
+          </w:rPr>
+          <w:t>סביבת</w:t>
+        </w:r>
+        <w:r>
+          <w:rPr>
+            <w:rStyle w:val="Hyperlink"/>
+            <w:noProof/>
+            <w:rtl/>
+          </w:rPr>
+          <w:t xml:space="preserve"> </w:t>
+        </w:r>
+        <w:r>
+          <w:rPr>
+            <w:rStyle w:val="Hyperlink"/>
+            <w:noProof/>
+          </w:rPr>
+          <w:t xml:space="preserve">React </w:t>
+        </w:r>
+        <w:r>
+          <w:rPr>
+            <w:rStyle w:val="Hyperlink"/>
+            <w:noProof/>
+            <w:rtl/>
+          </w:rPr>
+          <w:t xml:space="preserve"> </w:t>
+        </w:r>
+        <w:r>
+          <w:rPr>
+            <w:rStyle w:val="Hyperlink"/>
+            <w:rFonts w:hint="cs"/>
+            <w:noProof/>
+            <w:rtl/>
+          </w:rPr>
+          <w:t>ראשונה</w:t>
+        </w:r>
+        <w:r>
+          <w:rPr>
+            <w:rStyle w:val="Hyperlink"/>
+            <w:noProof/>
+            <w:rtl/>
+          </w:rPr>
+          <w:t xml:space="preserve"> </w:t>
+        </w:r>
+        <w:r>
+          <w:rPr>
+            <w:rStyle w:val="Hyperlink"/>
+            <w:rFonts w:hint="cs"/>
+            <w:noProof/>
+            <w:rtl/>
           </w:rPr>
           <w:t>לפרוייקט</w:t>
         </w:r>
@@ -1304,7 +1912,7 @@
             <w:noProof/>
             <w:webHidden/>
           </w:rPr>
-          <w:instrText xml:space="preserve"> PAGEREF _Toc206457422 \h </w:instrText>
+          <w:instrText xml:space="preserve"> PAGEREF _Toc206562857 \h </w:instrText>
         </w:r>
         <w:r>
           <w:rPr>
@@ -1324,7 +1932,7 @@
             <w:noProof/>
             <w:webHidden/>
           </w:rPr>
-          <w:t>5</w:t>
+          <w:t>9</w:t>
         </w:r>
         <w:r>
           <w:rPr>
@@ -1375,7 +1983,7 @@
           <w:lang w:val="en-US"/>
         </w:rPr>
       </w:pPr>
-      <w:bookmarkStart w:id="1" w:name="_Toc206457415"/>
+      <w:bookmarkStart w:id="1" w:name="_Toc206562846"/>
       <w:r>
         <w:rPr>
           <w:rFonts w:hint="cs"/>
@@ -1409,7 +2017,7 @@
           <w:lang w:val="en-US"/>
         </w:rPr>
       </w:pPr>
-      <w:bookmarkStart w:id="2" w:name="_Toc206457416"/>
+      <w:bookmarkStart w:id="2" w:name="_Toc206562847"/>
       <w:r>
         <w:rPr>
           <w:rStyle w:val="Heading1Char"/>
@@ -2053,7 +2661,7 @@
           <w:lang w:val="en-US"/>
         </w:rPr>
       </w:pPr>
-      <w:bookmarkStart w:id="3" w:name="_Toc206457417"/>
+      <w:bookmarkStart w:id="3" w:name="_Toc206562848"/>
       <w:r>
         <w:rPr>
           <w:rStyle w:val="Heading1Char"/>
@@ -2287,7 +2895,7 @@
           <w:lang w:val="en-US"/>
         </w:rPr>
       </w:pPr>
-      <w:bookmarkStart w:id="4" w:name="_Toc206457418"/>
+      <w:bookmarkStart w:id="4" w:name="_Toc206562849"/>
       <w:r>
         <w:rPr>
           <w:rStyle w:val="Heading1Char"/>
@@ -3647,18 +4255,17 @@
         <w:bidi/>
         <w:rPr>
           <w:rtl/>
-          <w:lang w:val="en-IL"/>
-        </w:rPr>
-      </w:pPr>
-      <w:bookmarkStart w:id="5" w:name="_Toc206457419"/>
+        </w:rPr>
+      </w:pPr>
+      <w:bookmarkStart w:id="5" w:name="_Toc206562850"/>
       <w:r>
         <w:rPr>
           <w:rFonts w:hint="cs"/>
           <w:rtl/>
-          <w:lang w:val="en-IL"/>
         </w:rPr>
         <w:t>דיאגנוסטיקה על חיבור תקשורת</w:t>
       </w:r>
+      <w:bookmarkEnd w:id="5"/>
     </w:p>
     <w:p>
       <w:pPr>
@@ -3666,98 +4273,72 @@
         <w:rPr>
           <w:rFonts w:cs="Arial"/>
           <w:rtl/>
-          <w:lang w:val="en-IL"/>
         </w:rPr>
       </w:pPr>
       <w:r>
         <w:rPr>
           <w:rFonts w:cs="Arial"/>
           <w:rtl/>
-          <w:lang w:val="en-IL"/>
         </w:rPr>
         <w:t>ה-</w:t>
       </w:r>
       <w:r>
-        <w:rPr>
-          <w:lang w:val="en-IL"/>
-        </w:rPr>
         <w:t>cmdlet Test-NetConnection</w:t>
       </w:r>
       <w:r>
         <w:rPr>
           <w:rFonts w:cs="Arial"/>
           <w:rtl/>
-          <w:lang w:val="en-IL"/>
         </w:rPr>
         <w:t xml:space="preserve"> מציג מידע אבחוני עבור חיבור. הוא תומך בבדיקת </w:t>
       </w:r>
       <w:r>
-        <w:rPr>
-          <w:lang w:val="en-IL"/>
-        </w:rPr>
         <w:t>ping</w:t>
       </w:r>
       <w:r>
         <w:rPr>
           <w:rFonts w:cs="Arial"/>
           <w:rtl/>
-          <w:lang w:val="en-IL"/>
         </w:rPr>
         <w:t xml:space="preserve">, בדיקת </w:t>
       </w:r>
       <w:r>
-        <w:rPr>
-          <w:lang w:val="en-IL"/>
-        </w:rPr>
         <w:t>TCP</w:t>
       </w:r>
       <w:r>
         <w:rPr>
           <w:rFonts w:cs="Arial"/>
           <w:rtl/>
-          <w:lang w:val="en-IL"/>
         </w:rPr>
         <w:t>, מעקב אחר מסלולים ואבחון בחירת מסלולים. בהתאם לפרמטרי הקלט, הפלט יכול לכלול את תוצאות חיפוש ה-</w:t>
       </w:r>
       <w:r>
-        <w:rPr>
-          <w:lang w:val="en-IL"/>
-        </w:rPr>
         <w:t>DNS</w:t>
       </w:r>
       <w:r>
         <w:rPr>
           <w:rFonts w:cs="Arial"/>
           <w:rtl/>
-          <w:lang w:val="en-IL"/>
         </w:rPr>
         <w:t xml:space="preserve">, רשימה של ממשקי </w:t>
       </w:r>
       <w:r>
-        <w:rPr>
-          <w:lang w:val="en-IL"/>
-        </w:rPr>
         <w:t>IP</w:t>
       </w:r>
       <w:r>
         <w:rPr>
           <w:rFonts w:cs="Arial"/>
           <w:rtl/>
-          <w:lang w:val="en-IL"/>
         </w:rPr>
         <w:t xml:space="preserve">, כללי </w:t>
       </w:r>
       <w:r>
-        <w:rPr>
-          <w:lang w:val="en-IL"/>
-        </w:rPr>
         <w:t>IPsec</w:t>
       </w:r>
       <w:r>
         <w:rPr>
           <w:rFonts w:cs="Arial"/>
           <w:rtl/>
-          <w:lang w:val="en-IL"/>
         </w:rPr>
         <w:t>, תוצאות בחירת כתובת מסלול/מקור ו/או אישור יצירת חיבור.</w:t>
       </w:r>
@@ -3767,14 +4348,12 @@
         <w:bidi/>
         <w:rPr>
           <w:rtl/>
-          <w:lang w:val="en-IL"/>
         </w:rPr>
       </w:pPr>
       <w:r>
         <w:rPr>
           <w:rFonts w:cs="Arial"/>
           <w:rtl/>
-          <w:lang w:val="en-IL"/>
         </w:rPr>
         <w:tab/>
       </w:r>
@@ -3782,7 +4361,6 @@
         <w:rPr>
           <w:rFonts w:cs="Arial"/>
           <w:rtl/>
-          <w:lang w:val="en-IL"/>
         </w:rPr>
         <w:tab/>
       </w:r>
@@ -3790,7 +4368,6 @@
         <w:rPr>
           <w:rFonts w:cs="Arial"/>
           <w:rtl/>
-          <w:lang w:val="en-IL"/>
         </w:rPr>
         <w:tab/>
       </w:r>
@@ -3798,7 +4375,6 @@
         <w:rPr>
           <w:rFonts w:cs="Arial"/>
           <w:rtl/>
-          <w:lang w:val="en-IL"/>
         </w:rPr>
         <w:tab/>
       </w:r>
@@ -3806,7 +4382,6 @@
         <w:rPr>
           <w:rFonts w:cs="Arial" w:hint="cs"/>
           <w:rtl/>
-          <w:lang w:val="en-IL"/>
         </w:rPr>
         <w:t>דוגמא:</w:t>
       </w:r>
@@ -3814,7 +4389,6 @@
     <w:p>
       <w:pPr>
         <w:rPr>
-          <w:rFonts w:hint="eastAsia"/>
           <w:lang w:val="en-US"/>
         </w:rPr>
       </w:pPr>
@@ -3838,6 +4412,7 @@
           <w:lang w:val="en-US"/>
         </w:rPr>
       </w:pPr>
+      <w:bookmarkStart w:id="6" w:name="_Toc206562851"/>
       <w:r>
         <w:rPr>
           <w:rFonts w:hint="cs"/>
@@ -3853,7 +4428,7 @@
         </w:rPr>
         <w:t>Entity Framework</w:t>
       </w:r>
-      <w:bookmarkEnd w:id="5"/>
+      <w:bookmarkEnd w:id="6"/>
     </w:p>
     <w:p>
       <w:pPr>
@@ -3869,7 +4444,7 @@
         <w:pStyle w:val="Heading2"/>
         <w:bidi/>
       </w:pPr>
-      <w:bookmarkStart w:id="6" w:name="_Toc206457420"/>
+      <w:bookmarkStart w:id="7" w:name="_Toc206562852"/>
       <w:r>
         <w:rPr>
           <w:rFonts w:ascii="Segoe UI Emoji" w:hAnsi="Segoe UI Emoji" w:cs="Segoe UI Emoji"/>
@@ -3905,7 +4480,7 @@
       <w:r>
         <w:t xml:space="preserve"> (</w:t>
       </w:r>
-      <w:bookmarkEnd w:id="6"/>
+      <w:bookmarkEnd w:id="7"/>
     </w:p>
     <w:p>
       <w:pPr>
@@ -4283,7 +4858,7 @@
           <w:rtl/>
         </w:rPr>
       </w:pPr>
-      <w:bookmarkStart w:id="7" w:name="_Toc206457421"/>
+      <w:bookmarkStart w:id="8" w:name="_Toc206562853"/>
       <w:r>
         <w:rPr>
           <w:rFonts w:hint="cs"/>
@@ -4298,6 +4873,7 @@
         </w:rPr>
         <w:t>Dockerfile</w:t>
       </w:r>
+      <w:bookmarkEnd w:id="8"/>
     </w:p>
     <w:p>
       <w:pPr>
@@ -4630,6 +5206,7 @@
           <w:lang w:val="en-US"/>
         </w:rPr>
       </w:pPr>
+      <w:bookmarkStart w:id="9" w:name="_Toc206562854"/>
       <w:r>
         <w:rPr>
           <w:rFonts w:hint="cs"/>
@@ -4645,6 +5222,7 @@
         </w:rPr>
         <w:t>docker-compose.yml</w:t>
       </w:r>
+      <w:bookmarkEnd w:id="9"/>
     </w:p>
     <w:p>
       <w:pPr>
@@ -6423,6 +7001,7 @@
           <w:lang w:val="en-US"/>
         </w:rPr>
       </w:pPr>
+      <w:bookmarkStart w:id="10" w:name="_Toc206562855"/>
       <w:r>
         <w:rPr>
           <w:rFonts w:hint="cs"/>
@@ -6439,6 +7018,7 @@
         </w:rPr>
         <w:t>ר</w:t>
       </w:r>
+      <w:bookmarkEnd w:id="10"/>
     </w:p>
     <w:p>
       <w:pPr>
@@ -6658,7 +7238,6 @@
         <w:t>docker-compose up –build</w:t>
       </w:r>
     </w:p>
-    <w:bookmarkEnd w:id="7"/>
     <w:p>
       <w:pPr>
         <w:pStyle w:val="Heading1"/>
@@ -6672,6 +7251,7 @@
           <w:lang w:val="en-US"/>
         </w:rPr>
       </w:pPr>
+      <w:bookmarkStart w:id="11" w:name="_Toc206562856"/>
       <w:r>
         <w:rPr>
           <w:rFonts w:hint="cs"/>
@@ -6680,6 +7260,7 @@
         </w:rPr>
         <w:t>פקודות קובץ הדוקר</w:t>
       </w:r>
+      <w:bookmarkEnd w:id="11"/>
     </w:p>
     <w:p>
       <w:pPr>
@@ -9811,7 +10392,7 @@
           <w:lang w:val="en-US"/>
         </w:rPr>
       </w:pPr>
-      <w:bookmarkStart w:id="8" w:name="_Toc206457422"/>
+      <w:bookmarkStart w:id="12" w:name="_Toc206562857"/>
       <w:r>
         <w:rPr>
           <w:rFonts w:hint="cs"/>
@@ -9832,7 +10413,7 @@
         </w:rPr>
         <w:t xml:space="preserve"> ראשונה לפרוייקט</w:t>
       </w:r>
-      <w:bookmarkEnd w:id="8"/>
+      <w:bookmarkEnd w:id="12"/>
     </w:p>
     <w:p>
       <w:pPr>

</xml_diff>

<commit_message>
New Gateway service + DB utils console app
</commit_message>
<xml_diff>
--- a/Documentations/UsefulCommands.docx
+++ b/Documentations/UsefulCommands.docx
@@ -45,7 +45,6 @@
           <w:kern w:val="2"/>
           <w:sz w:val="24"/>
           <w:szCs w:val="24"/>
-          <w:lang w:val="en-IL"/>
         </w:rPr>
       </w:pPr>
       <w:r>
@@ -155,7 +154,6 @@
           <w:kern w:val="2"/>
           <w:sz w:val="24"/>
           <w:szCs w:val="24"/>
-          <w:lang w:val="en-IL"/>
         </w:rPr>
       </w:pPr>
       <w:hyperlink w:anchor="_Toc206562846" w:history="1">
@@ -174,7 +172,6 @@
             <w:kern w:val="2"/>
             <w:sz w:val="24"/>
             <w:szCs w:val="24"/>
-            <w:lang w:val="en-IL"/>
           </w:rPr>
           <w:tab/>
         </w:r>
@@ -264,7 +261,6 @@
           <w:kern w:val="2"/>
           <w:sz w:val="24"/>
           <w:szCs w:val="24"/>
-          <w:lang w:val="en-IL"/>
         </w:rPr>
       </w:pPr>
       <w:hyperlink w:anchor="_Toc206562847" w:history="1">
@@ -498,7 +494,6 @@
           <w:kern w:val="2"/>
           <w:sz w:val="24"/>
           <w:szCs w:val="24"/>
-          <w:lang w:val="en-IL"/>
         </w:rPr>
       </w:pPr>
       <w:hyperlink w:anchor="_Toc206562848" w:history="1">
@@ -672,7 +667,6 @@
           <w:kern w:val="2"/>
           <w:sz w:val="24"/>
           <w:szCs w:val="24"/>
-          <w:lang w:val="en-IL"/>
         </w:rPr>
       </w:pPr>
       <w:hyperlink w:anchor="_Toc206562849" w:history="1">
@@ -803,7 +797,6 @@
           <w:kern w:val="2"/>
           <w:sz w:val="24"/>
           <w:szCs w:val="24"/>
-          <w:lang w:val="en-IL"/>
         </w:rPr>
       </w:pPr>
       <w:hyperlink w:anchor="_Toc206562850" w:history="1">
@@ -821,7 +814,6 @@
             <w:kern w:val="2"/>
             <w:sz w:val="24"/>
             <w:szCs w:val="24"/>
-            <w:lang w:val="en-IL"/>
           </w:rPr>
           <w:tab/>
         </w:r>
@@ -947,7 +939,6 @@
           <w:kern w:val="2"/>
           <w:sz w:val="24"/>
           <w:szCs w:val="24"/>
-          <w:lang w:val="en-IL"/>
         </w:rPr>
       </w:pPr>
       <w:hyperlink w:anchor="_Toc206562851" w:history="1">
@@ -966,7 +957,6 @@
             <w:kern w:val="2"/>
             <w:sz w:val="24"/>
             <w:szCs w:val="24"/>
-            <w:lang w:val="en-IL"/>
           </w:rPr>
           <w:tab/>
         </w:r>
@@ -1058,7 +1048,6 @@
           <w:kern w:val="2"/>
           <w:sz w:val="24"/>
           <w:szCs w:val="24"/>
-          <w:lang w:val="en-IL"/>
         </w:rPr>
       </w:pPr>
       <w:hyperlink w:anchor="_Toc206562852" w:history="1">
@@ -1219,7 +1208,6 @@
           <w:kern w:val="2"/>
           <w:sz w:val="24"/>
           <w:szCs w:val="24"/>
-          <w:lang w:val="en-IL"/>
         </w:rPr>
       </w:pPr>
       <w:hyperlink w:anchor="_Toc206562853" w:history="1">
@@ -1237,7 +1225,6 @@
             <w:kern w:val="2"/>
             <w:sz w:val="24"/>
             <w:szCs w:val="24"/>
-            <w:lang w:val="en-IL"/>
           </w:rPr>
           <w:tab/>
         </w:r>
@@ -1361,7 +1348,6 @@
           <w:kern w:val="2"/>
           <w:sz w:val="24"/>
           <w:szCs w:val="24"/>
-          <w:lang w:val="en-IL"/>
         </w:rPr>
       </w:pPr>
       <w:hyperlink w:anchor="_Toc206562854" w:history="1">
@@ -1379,7 +1365,6 @@
             <w:kern w:val="2"/>
             <w:sz w:val="24"/>
             <w:szCs w:val="24"/>
-            <w:lang w:val="en-IL"/>
           </w:rPr>
           <w:tab/>
         </w:r>
@@ -1529,7 +1514,6 @@
           <w:kern w:val="2"/>
           <w:sz w:val="24"/>
           <w:szCs w:val="24"/>
-          <w:lang w:val="en-IL"/>
         </w:rPr>
       </w:pPr>
       <w:hyperlink w:anchor="_Toc206562855" w:history="1">
@@ -1548,7 +1532,6 @@
             <w:kern w:val="2"/>
             <w:sz w:val="24"/>
             <w:szCs w:val="24"/>
-            <w:lang w:val="en-IL"/>
           </w:rPr>
           <w:tab/>
         </w:r>
@@ -1662,7 +1645,6 @@
           <w:kern w:val="2"/>
           <w:sz w:val="24"/>
           <w:szCs w:val="24"/>
-          <w:lang w:val="en-IL"/>
         </w:rPr>
       </w:pPr>
       <w:hyperlink w:anchor="_Toc206562856" w:history="1">
@@ -1681,7 +1663,6 @@
             <w:kern w:val="2"/>
             <w:sz w:val="24"/>
             <w:szCs w:val="24"/>
-            <w:lang w:val="en-IL"/>
           </w:rPr>
           <w:tab/>
         </w:r>
@@ -1795,7 +1776,6 @@
           <w:kern w:val="2"/>
           <w:sz w:val="24"/>
           <w:szCs w:val="24"/>
-          <w:lang w:val="en-IL"/>
         </w:rPr>
       </w:pPr>
       <w:hyperlink w:anchor="_Toc206562857" w:history="1">
@@ -1814,7 +1794,6 @@
             <w:kern w:val="2"/>
             <w:sz w:val="24"/>
             <w:szCs w:val="24"/>
-            <w:lang w:val="en-IL"/>
           </w:rPr>
           <w:tab/>
         </w:r>
@@ -2254,8 +2233,18 @@
           <w:sz w:val="24"/>
           <w:szCs w:val="24"/>
         </w:rPr>
-        <w:t>git init</w:t>
-      </w:r>
+        <w:t xml:space="preserve">git </w:t>
+      </w:r>
+      <w:proofErr w:type="spellStart"/>
+      <w:r>
+        <w:rPr>
+          <w:rFonts w:ascii="Segoe UI Emoji" w:hAnsi="Segoe UI Emoji" w:cs="Segoe UI Emoji"/>
+          <w:sz w:val="24"/>
+          <w:szCs w:val="24"/>
+        </w:rPr>
+        <w:t>init</w:t>
+      </w:r>
+      <w:proofErr w:type="spellEnd"/>
     </w:p>
     <w:p>
       <w:pPr>
@@ -2330,7 +2319,7 @@
         </w:rPr>
         <w:t>ל־</w:t>
       </w:r>
-      <w:hyperlink r:id="rId5" w:tgtFrame="_new" w:history="1">
+      <w:hyperlink r:id="rId6" w:tgtFrame="_new" w:history="1">
         <w:r>
           <w:rPr>
             <w:rStyle w:val="Hyperlink"/>
@@ -2466,8 +2455,18 @@
           <w:sz w:val="24"/>
           <w:szCs w:val="24"/>
         </w:rPr>
-        <w:t>: MyProject</w:t>
-      </w:r>
+        <w:t xml:space="preserve">: </w:t>
+      </w:r>
+      <w:proofErr w:type="spellStart"/>
+      <w:r>
+        <w:rPr>
+          <w:rFonts w:ascii="Segoe UI Emoji" w:hAnsi="Segoe UI Emoji" w:cs="Segoe UI Emoji"/>
+          <w:sz w:val="24"/>
+          <w:szCs w:val="24"/>
+        </w:rPr>
+        <w:t>MyProject</w:t>
+      </w:r>
+      <w:proofErr w:type="spellEnd"/>
     </w:p>
     <w:p>
       <w:pPr>
@@ -2768,7 +2767,7 @@
         </w:rPr>
         <w:t xml:space="preserve">git remote add origin </w:t>
       </w:r>
-      <w:hyperlink r:id="rId6" w:history="1">
+      <w:hyperlink r:id="rId7" w:history="1">
         <w:r>
           <w:t>https://github.com/USERNAME/REPO_NAME.git</w:t>
         </w:r>
@@ -2883,7 +2882,21 @@
         <w:rPr>
           <w:rFonts w:ascii="Segoe UI Emoji" w:hAnsi="Segoe UI Emoji" w:cs="Segoe UI Emoji"/>
         </w:rPr>
-        <w:t>git remote set-url origin https://github.com/USERNAME/REPO_NAME.git</w:t>
+        <w:t>git remote set-</w:t>
+      </w:r>
+      <w:proofErr w:type="spellStart"/>
+      <w:r>
+        <w:rPr>
+          <w:rFonts w:ascii="Segoe UI Emoji" w:hAnsi="Segoe UI Emoji" w:cs="Segoe UI Emoji"/>
+        </w:rPr>
+        <w:t>url</w:t>
+      </w:r>
+      <w:proofErr w:type="spellEnd"/>
+      <w:r>
+        <w:rPr>
+          <w:rFonts w:ascii="Segoe UI Emoji" w:hAnsi="Segoe UI Emoji" w:cs="Segoe UI Emoji"/>
+        </w:rPr>
+        <w:t xml:space="preserve"> origin https://github.com/USERNAME/REPO_NAME.git</w:t>
       </w:r>
     </w:p>
     <w:p>
@@ -2975,8 +2988,18 @@
           <w:sz w:val="24"/>
           <w:szCs w:val="24"/>
         </w:rPr>
-        <w:t>git add .</w:t>
-      </w:r>
+        <w:t xml:space="preserve">git </w:t>
+      </w:r>
+      <w:proofErr w:type="gramStart"/>
+      <w:r>
+        <w:rPr>
+          <w:rFonts w:ascii="Segoe UI Emoji" w:hAnsi="Segoe UI Emoji" w:cs="Segoe UI Emoji"/>
+          <w:sz w:val="24"/>
+          <w:szCs w:val="24"/>
+        </w:rPr>
+        <w:t>add .</w:t>
+      </w:r>
+      <w:proofErr w:type="gramEnd"/>
     </w:p>
     <w:p>
       <w:pPr>
@@ -3340,8 +3363,18 @@
           <w:szCs w:val="24"/>
           <w:lang w:val="en-US"/>
         </w:rPr>
-        <w:t>git add .</w:t>
-      </w:r>
+        <w:t xml:space="preserve">git </w:t>
+      </w:r>
+      <w:proofErr w:type="gramStart"/>
+      <w:r>
+        <w:rPr>
+          <w:sz w:val="24"/>
+          <w:szCs w:val="24"/>
+          <w:lang w:val="en-US"/>
+        </w:rPr>
+        <w:t>add .</w:t>
+      </w:r>
+      <w:proofErr w:type="gramEnd"/>
     </w:p>
     <w:p>
       <w:pPr>
@@ -3387,8 +3420,19 @@
           <w:szCs w:val="24"/>
           <w:lang w:val="en-US"/>
         </w:rPr>
-        <w:t>git add path/to/file.cs</w:t>
-      </w:r>
+        <w:t>git add path/to/</w:t>
+      </w:r>
+      <w:proofErr w:type="spellStart"/>
+      <w:r>
+        <w:rPr>
+          <w:rFonts w:cs="Arial"/>
+          <w:sz w:val="24"/>
+          <w:szCs w:val="24"/>
+          <w:lang w:val="en-US"/>
+        </w:rPr>
+        <w:t>file.cs</w:t>
+      </w:r>
+      <w:proofErr w:type="spellEnd"/>
     </w:p>
     <w:p>
       <w:pPr>
@@ -3686,8 +3730,19 @@
           <w:szCs w:val="24"/>
           <w:lang w:val="en-US"/>
         </w:rPr>
-        <w:t>git pull</w:t>
-      </w:r>
+        <w:t xml:space="preserve">git </w:t>
+      </w:r>
+      <w:proofErr w:type="gramStart"/>
+      <w:r>
+        <w:rPr>
+          <w:rFonts w:cs="Arial"/>
+          <w:sz w:val="24"/>
+          <w:szCs w:val="24"/>
+          <w:lang w:val="en-US"/>
+        </w:rPr>
+        <w:t>pull</w:t>
+      </w:r>
+      <w:proofErr w:type="gramEnd"/>
     </w:p>
     <w:p>
       <w:pPr>
@@ -3790,13 +3845,31 @@
           <w:sz w:val="24"/>
           <w:szCs w:val="24"/>
         </w:rPr>
-        <w:t xml:space="preserve">bin/, obj/, appsettings.Development.json </w:t>
-      </w:r>
+        <w:t xml:space="preserve">bin/, obj/, </w:t>
+      </w:r>
+      <w:proofErr w:type="spellStart"/>
       <w:r>
         <w:rPr>
           <w:rFonts w:cs="Arial"/>
           <w:sz w:val="24"/>
           <w:szCs w:val="24"/>
+        </w:rPr>
+        <w:t>appsettings.Development.json</w:t>
+      </w:r>
+      <w:proofErr w:type="spellEnd"/>
+      <w:r>
+        <w:rPr>
+          <w:rFonts w:cs="Arial"/>
+          <w:sz w:val="24"/>
+          <w:szCs w:val="24"/>
+        </w:rPr>
+        <w:t xml:space="preserve"> </w:t>
+      </w:r>
+      <w:r>
+        <w:rPr>
+          <w:rFonts w:cs="Arial"/>
+          <w:sz w:val="24"/>
+          <w:szCs w:val="24"/>
           <w:rtl/>
           <w:lang w:val="en-US"/>
         </w:rPr>
@@ -3841,7 +3914,25 @@
           <w:sz w:val="24"/>
           <w:szCs w:val="24"/>
         </w:rPr>
-        <w:t xml:space="preserve">.gitignore </w:t>
+        <w:t>.</w:t>
+      </w:r>
+      <w:proofErr w:type="spellStart"/>
+      <w:r>
+        <w:rPr>
+          <w:rFonts w:cs="Arial"/>
+          <w:sz w:val="24"/>
+          <w:szCs w:val="24"/>
+        </w:rPr>
+        <w:t>gitignore</w:t>
+      </w:r>
+      <w:proofErr w:type="spellEnd"/>
+      <w:r>
+        <w:rPr>
+          <w:rFonts w:cs="Arial"/>
+          <w:sz w:val="24"/>
+          <w:szCs w:val="24"/>
+        </w:rPr>
+        <w:t xml:space="preserve"> </w:t>
       </w:r>
       <w:r>
         <w:rPr>
@@ -3999,8 +4090,18 @@
           <w:sz w:val="24"/>
           <w:szCs w:val="24"/>
         </w:rPr>
-        <w:t>.gitignore</w:t>
-      </w:r>
+        <w:t>.</w:t>
+      </w:r>
+      <w:proofErr w:type="spellStart"/>
+      <w:r>
+        <w:rPr>
+          <w:rFonts w:cs="Arial"/>
+          <w:sz w:val="24"/>
+          <w:szCs w:val="24"/>
+        </w:rPr>
+        <w:t>gitignore</w:t>
+      </w:r>
+      <w:proofErr w:type="spellEnd"/>
     </w:p>
     <w:p>
       <w:pPr>
@@ -4129,7 +4230,25 @@
           <w:sz w:val="24"/>
           <w:szCs w:val="24"/>
         </w:rPr>
-        <w:t>.gitignore </w:t>
+        <w:t>.</w:t>
+      </w:r>
+      <w:proofErr w:type="spellStart"/>
+      <w:r>
+        <w:rPr>
+          <w:rFonts w:cs="Arial"/>
+          <w:sz w:val="24"/>
+          <w:szCs w:val="24"/>
+        </w:rPr>
+        <w:t>gitignore</w:t>
+      </w:r>
+      <w:proofErr w:type="spellEnd"/>
+      <w:r>
+        <w:rPr>
+          <w:rFonts w:cs="Arial"/>
+          <w:sz w:val="24"/>
+          <w:szCs w:val="24"/>
+        </w:rPr>
+        <w:t> </w:t>
       </w:r>
       <w:r>
         <w:rPr>
@@ -4283,8 +4402,13 @@
         <w:t>ה-</w:t>
       </w:r>
       <w:r>
-        <w:t>cmdlet Test-NetConnection</w:t>
-      </w:r>
+        <w:t>cmdlet Test-</w:t>
+      </w:r>
+      <w:proofErr w:type="spellStart"/>
+      <w:r>
+        <w:t>NetConnection</w:t>
+      </w:r>
+      <w:proofErr w:type="spellEnd"/>
       <w:r>
         <w:rPr>
           <w:rFonts w:cs="Arial"/>
@@ -4396,7 +4520,35 @@
         <w:rPr>
           <w:lang w:val="en-US"/>
         </w:rPr>
-        <w:t>Test-NetConnection -ComputerName localhost -Port 5432</w:t>
+        <w:t>Test-</w:t>
+      </w:r>
+      <w:proofErr w:type="spellStart"/>
+      <w:r>
+        <w:rPr>
+          <w:lang w:val="en-US"/>
+        </w:rPr>
+        <w:t>NetConnection</w:t>
+      </w:r>
+      <w:proofErr w:type="spellEnd"/>
+      <w:r>
+        <w:rPr>
+          <w:lang w:val="en-US"/>
+        </w:rPr>
+        <w:t xml:space="preserve"> -</w:t>
+      </w:r>
+      <w:proofErr w:type="spellStart"/>
+      <w:r>
+        <w:rPr>
+          <w:lang w:val="en-US"/>
+        </w:rPr>
+        <w:t>ComputerName</w:t>
+      </w:r>
+      <w:proofErr w:type="spellEnd"/>
+      <w:r>
+        <w:rPr>
+          <w:lang w:val="en-US"/>
+        </w:rPr>
+        <w:t xml:space="preserve"> localhost -Port 5432</w:t>
       </w:r>
     </w:p>
     <w:p>
@@ -4500,8 +4652,17 @@
           <w:sz w:val="24"/>
           <w:szCs w:val="24"/>
         </w:rPr>
-        <w:t>dotnet tool install --global dotnet-ef</w:t>
-      </w:r>
+        <w:t>dotnet tool install --global dotnet-</w:t>
+      </w:r>
+      <w:proofErr w:type="spellStart"/>
+      <w:r>
+        <w:rPr>
+          <w:sz w:val="24"/>
+          <w:szCs w:val="24"/>
+        </w:rPr>
+        <w:t>ef</w:t>
+      </w:r>
+      <w:proofErr w:type="spellEnd"/>
     </w:p>
     <w:p>
       <w:pPr>
@@ -4563,8 +4724,21 @@
         <w:ind w:firstLine="720"/>
       </w:pPr>
       <w:r>
-        <w:t>dotnet ef migrations add AddUserRolesSeeder</w:t>
-      </w:r>
+        <w:t xml:space="preserve">dotnet </w:t>
+      </w:r>
+      <w:proofErr w:type="spellStart"/>
+      <w:r>
+        <w:t>ef</w:t>
+      </w:r>
+      <w:proofErr w:type="spellEnd"/>
+      <w:r>
+        <w:t xml:space="preserve"> migrations add </w:t>
+      </w:r>
+      <w:proofErr w:type="spellStart"/>
+      <w:r>
+        <w:t>AddUserRolesSeeder</w:t>
+      </w:r>
+      <w:proofErr w:type="spellEnd"/>
     </w:p>
     <w:p>
       <w:pPr>
@@ -4624,8 +4798,21 @@
         </w:rPr>
       </w:pPr>
       <w:r>
-        <w:t>dotnet ef migrations add AddUserRolesSeeder</w:t>
-      </w:r>
+        <w:t>dotnet </w:t>
+      </w:r>
+      <w:proofErr w:type="spellStart"/>
+      <w:r>
+        <w:t>ef</w:t>
+      </w:r>
+      <w:proofErr w:type="spellEnd"/>
+      <w:r>
+        <w:t> migrations add </w:t>
+      </w:r>
+      <w:proofErr w:type="spellStart"/>
+      <w:r>
+        <w:t>AddUserRolesSeeder</w:t>
+      </w:r>
+      <w:proofErr w:type="spellEnd"/>
     </w:p>
     <w:p>
       <w:pPr>
@@ -4653,6 +4840,7 @@
         </w:rPr>
         <w:t>20250814113020_</w:t>
       </w:r>
+      <w:proofErr w:type="spellStart"/>
       <w:r>
         <w:rPr>
           <w:rFonts w:eastAsiaTheme="minorEastAsia"/>
@@ -4660,6 +4848,7 @@
         </w:rPr>
         <w:t>AddUserRolesSeeder.cs</w:t>
       </w:r>
+      <w:proofErr w:type="spellEnd"/>
       <w:r>
         <w:rPr>
           <w:rFonts w:eastAsiaTheme="minorEastAsia" w:hint="cs"/>
@@ -4720,7 +4909,27 @@
           <w:szCs w:val="24"/>
           <w14:ligatures w14:val="none"/>
         </w:rPr>
-        <w:t>dotnet ef database update</w:t>
+        <w:t>dotnet </w:t>
+      </w:r>
+      <w:proofErr w:type="spellStart"/>
+      <w:r>
+        <w:rPr>
+          <w:rFonts w:ascii="Times New Roman" w:eastAsia="Times New Roman" w:hAnsi="Times New Roman" w:cs="Times New Roman"/>
+          <w:sz w:val="24"/>
+          <w:szCs w:val="24"/>
+          <w14:ligatures w14:val="none"/>
+        </w:rPr>
+        <w:t>ef</w:t>
+      </w:r>
+      <w:proofErr w:type="spellEnd"/>
+      <w:r>
+        <w:rPr>
+          <w:rFonts w:ascii="Times New Roman" w:eastAsia="Times New Roman" w:hAnsi="Times New Roman" w:cs="Times New Roman"/>
+          <w:sz w:val="24"/>
+          <w:szCs w:val="24"/>
+          <w14:ligatures w14:val="none"/>
+        </w:rPr>
+        <w:t> database update</w:t>
       </w:r>
     </w:p>
     <w:p>
@@ -4767,7 +4976,27 @@
           <w:szCs w:val="24"/>
           <w14:ligatures w14:val="none"/>
         </w:rPr>
-        <w:t>dotnet ef migrations list</w:t>
+        <w:t>dotnet </w:t>
+      </w:r>
+      <w:proofErr w:type="spellStart"/>
+      <w:r>
+        <w:rPr>
+          <w:rFonts w:ascii="Times New Roman" w:eastAsia="Times New Roman" w:hAnsi="Times New Roman" w:cs="Times New Roman"/>
+          <w:sz w:val="24"/>
+          <w:szCs w:val="24"/>
+          <w14:ligatures w14:val="none"/>
+        </w:rPr>
+        <w:t>ef</w:t>
+      </w:r>
+      <w:proofErr w:type="spellEnd"/>
+      <w:r>
+        <w:rPr>
+          <w:rFonts w:ascii="Times New Roman" w:eastAsia="Times New Roman" w:hAnsi="Times New Roman" w:cs="Times New Roman"/>
+          <w:sz w:val="24"/>
+          <w:szCs w:val="24"/>
+          <w14:ligatures w14:val="none"/>
+        </w:rPr>
+        <w:t> migrations list</w:t>
       </w:r>
     </w:p>
     <w:p>
@@ -4814,7 +5043,47 @@
           <w:szCs w:val="24"/>
           <w14:ligatures w14:val="none"/>
         </w:rPr>
-        <w:t>dotnet ef dbcontext list</w:t>
+        <w:t>dotnet </w:t>
+      </w:r>
+      <w:proofErr w:type="spellStart"/>
+      <w:r>
+        <w:rPr>
+          <w:rFonts w:ascii="Times New Roman" w:eastAsia="Times New Roman" w:hAnsi="Times New Roman" w:cs="Times New Roman"/>
+          <w:sz w:val="24"/>
+          <w:szCs w:val="24"/>
+          <w14:ligatures w14:val="none"/>
+        </w:rPr>
+        <w:t>ef</w:t>
+      </w:r>
+      <w:proofErr w:type="spellEnd"/>
+      <w:r>
+        <w:rPr>
+          <w:rFonts w:ascii="Times New Roman" w:eastAsia="Times New Roman" w:hAnsi="Times New Roman" w:cs="Times New Roman"/>
+          <w:sz w:val="24"/>
+          <w:szCs w:val="24"/>
+          <w14:ligatures w14:val="none"/>
+        </w:rPr>
+        <w:t> </w:t>
+      </w:r>
+      <w:proofErr w:type="spellStart"/>
+      <w:r>
+        <w:rPr>
+          <w:rFonts w:ascii="Times New Roman" w:eastAsia="Times New Roman" w:hAnsi="Times New Roman" w:cs="Times New Roman"/>
+          <w:sz w:val="24"/>
+          <w:szCs w:val="24"/>
+          <w14:ligatures w14:val="none"/>
+        </w:rPr>
+        <w:t>dbcontext</w:t>
+      </w:r>
+      <w:proofErr w:type="spellEnd"/>
+      <w:r>
+        <w:rPr>
+          <w:rFonts w:ascii="Times New Roman" w:eastAsia="Times New Roman" w:hAnsi="Times New Roman" w:cs="Times New Roman"/>
+          <w:sz w:val="24"/>
+          <w:szCs w:val="24"/>
+          <w14:ligatures w14:val="none"/>
+        </w:rPr>
+        <w:t> list</w:t>
       </w:r>
     </w:p>
     <w:p>
@@ -4836,7 +5105,47 @@
           <w:szCs w:val="24"/>
           <w14:ligatures w14:val="none"/>
         </w:rPr>
-        <w:t>dotnet ef dbcontext info</w:t>
+        <w:t>dotnet </w:t>
+      </w:r>
+      <w:proofErr w:type="spellStart"/>
+      <w:r>
+        <w:rPr>
+          <w:rFonts w:ascii="Times New Roman" w:eastAsia="Times New Roman" w:hAnsi="Times New Roman" w:cs="Times New Roman"/>
+          <w:sz w:val="24"/>
+          <w:szCs w:val="24"/>
+          <w14:ligatures w14:val="none"/>
+        </w:rPr>
+        <w:t>ef</w:t>
+      </w:r>
+      <w:proofErr w:type="spellEnd"/>
+      <w:r>
+        <w:rPr>
+          <w:rFonts w:ascii="Times New Roman" w:eastAsia="Times New Roman" w:hAnsi="Times New Roman" w:cs="Times New Roman"/>
+          <w:sz w:val="24"/>
+          <w:szCs w:val="24"/>
+          <w14:ligatures w14:val="none"/>
+        </w:rPr>
+        <w:t> </w:t>
+      </w:r>
+      <w:proofErr w:type="spellStart"/>
+      <w:r>
+        <w:rPr>
+          <w:rFonts w:ascii="Times New Roman" w:eastAsia="Times New Roman" w:hAnsi="Times New Roman" w:cs="Times New Roman"/>
+          <w:sz w:val="24"/>
+          <w:szCs w:val="24"/>
+          <w14:ligatures w14:val="none"/>
+        </w:rPr>
+        <w:t>dbcontext</w:t>
+      </w:r>
+      <w:proofErr w:type="spellEnd"/>
+      <w:r>
+        <w:rPr>
+          <w:rFonts w:ascii="Times New Roman" w:eastAsia="Times New Roman" w:hAnsi="Times New Roman" w:cs="Times New Roman"/>
+          <w:sz w:val="24"/>
+          <w:szCs w:val="24"/>
+          <w14:ligatures w14:val="none"/>
+        </w:rPr>
+        <w:t> info</w:t>
       </w:r>
     </w:p>
     <w:p>
@@ -4867,6 +5176,7 @@
         <w:lastRenderedPageBreak/>
         <w:t xml:space="preserve">מהו קובץ הדוקר </w:t>
       </w:r>
+      <w:proofErr w:type="spellStart"/>
       <w:r>
         <w:rPr>
           <w:rFonts w:hint="eastAsia"/>
@@ -4874,6 +5184,7 @@
         <w:t>Dockerfile</w:t>
       </w:r>
       <w:bookmarkEnd w:id="8"/>
+      <w:proofErr w:type="spellEnd"/>
     </w:p>
     <w:p>
       <w:pPr>
@@ -4883,6 +5194,7 @@
           <w:bCs/>
         </w:rPr>
       </w:pPr>
+      <w:proofErr w:type="spellStart"/>
       <w:r>
         <w:rPr>
           <w:b/>
@@ -4890,6 +5202,7 @@
         </w:rPr>
         <w:t>Dockerfile</w:t>
       </w:r>
+      <w:proofErr w:type="spellEnd"/>
     </w:p>
     <w:p>
       <w:pPr>
@@ -4921,6 +5234,7 @@
         </w:rPr>
         <w:t xml:space="preserve">לבנות </w:t>
       </w:r>
+      <w:proofErr w:type="gramStart"/>
       <w:r>
         <w:rPr>
           <w:b/>
@@ -4944,6 +5258,7 @@
         </w:rPr>
         <w:t>אחד</w:t>
       </w:r>
+      <w:proofErr w:type="gramEnd"/>
       <w:r>
         <w:t>.</w:t>
       </w:r>
@@ -5160,8 +5475,13 @@
         <w:bidi/>
       </w:pPr>
       <w:r>
-        <w:t>COPY --from=publish /app/publish .</w:t>
-      </w:r>
+        <w:t>COPY --from=publish /app/</w:t>
+      </w:r>
+      <w:proofErr w:type="gramStart"/>
+      <w:r>
+        <w:t>publish .</w:t>
+      </w:r>
+      <w:proofErr w:type="gramEnd"/>
     </w:p>
     <w:p>
       <w:pPr>
@@ -5220,9 +5540,18 @@
           <w:rFonts w:hint="eastAsia"/>
           <w:lang w:val="en-US"/>
         </w:rPr>
-        <w:t>docker-compose.yml</w:t>
+        <w:t>docker-</w:t>
+      </w:r>
+      <w:proofErr w:type="spellStart"/>
+      <w:r>
+        <w:rPr>
+          <w:rFonts w:hint="eastAsia"/>
+          <w:lang w:val="en-US"/>
+        </w:rPr>
+        <w:t>compose.yml</w:t>
       </w:r>
       <w:bookmarkEnd w:id="9"/>
+      <w:proofErr w:type="spellEnd"/>
     </w:p>
     <w:p>
       <w:pPr>
@@ -5237,8 +5566,17 @@
           <w:b/>
           <w:bCs/>
         </w:rPr>
-        <w:t>docker-compose.yml</w:t>
-      </w:r>
+        <w:t>docker-</w:t>
+      </w:r>
+      <w:proofErr w:type="spellStart"/>
+      <w:r>
+        <w:rPr>
+          <w:b/>
+          <w:bCs/>
+        </w:rPr>
+        <w:t>compose.yml</w:t>
+      </w:r>
+      <w:proofErr w:type="spellEnd"/>
     </w:p>
     <w:p>
       <w:pPr>
@@ -5518,16 +5856,29 @@
         <w:bidi/>
       </w:pPr>
       <w:r>
-        <w:t xml:space="preserve">  authservice:</w:t>
-      </w:r>
-    </w:p>
-    <w:p>
-      <w:pPr>
-        <w:bidi/>
-      </w:pPr>
-      <w:r>
-        <w:t xml:space="preserve">    build: .</w:t>
-      </w:r>
+        <w:t xml:space="preserve">  </w:t>
+      </w:r>
+      <w:proofErr w:type="spellStart"/>
+      <w:r>
+        <w:t>authservice</w:t>
+      </w:r>
+      <w:proofErr w:type="spellEnd"/>
+      <w:r>
+        <w:t>:</w:t>
+      </w:r>
+    </w:p>
+    <w:p>
+      <w:pPr>
+        <w:bidi/>
+      </w:pPr>
+      <w:r>
+        <w:t xml:space="preserve">    build</w:t>
+      </w:r>
+      <w:proofErr w:type="gramStart"/>
+      <w:r>
+        <w:t>: .</w:t>
+      </w:r>
+      <w:proofErr w:type="gramEnd"/>
     </w:p>
     <w:p>
       <w:pPr>
@@ -5567,28 +5918,49 @@
         <w:bidi/>
       </w:pPr>
       <w:r>
-        <w:t xml:space="preserve">    depends_on:</w:t>
-      </w:r>
-    </w:p>
-    <w:p>
-      <w:pPr>
-        <w:bidi/>
-      </w:pPr>
-      <w:r>
-        <w:t xml:space="preserve">      - db</w:t>
-      </w:r>
-    </w:p>
-    <w:p>
-      <w:pPr>
-        <w:bidi/>
-      </w:pPr>
-    </w:p>
-    <w:p>
-      <w:pPr>
-        <w:bidi/>
-      </w:pPr>
-      <w:r>
-        <w:t xml:space="preserve">  db:</w:t>
+        <w:t xml:space="preserve">    </w:t>
+      </w:r>
+      <w:proofErr w:type="spellStart"/>
+      <w:r>
+        <w:t>depends_on</w:t>
+      </w:r>
+      <w:proofErr w:type="spellEnd"/>
+      <w:r>
+        <w:t>:</w:t>
+      </w:r>
+    </w:p>
+    <w:p>
+      <w:pPr>
+        <w:bidi/>
+      </w:pPr>
+      <w:r>
+        <w:t xml:space="preserve">      - </w:t>
+      </w:r>
+      <w:proofErr w:type="spellStart"/>
+      <w:r>
+        <w:t>db</w:t>
+      </w:r>
+      <w:proofErr w:type="spellEnd"/>
+    </w:p>
+    <w:p>
+      <w:pPr>
+        <w:bidi/>
+      </w:pPr>
+    </w:p>
+    <w:p>
+      <w:pPr>
+        <w:bidi/>
+      </w:pPr>
+      <w:r>
+        <w:t xml:space="preserve">  </w:t>
+      </w:r>
+      <w:proofErr w:type="spellStart"/>
+      <w:r>
+        <w:t>db</w:t>
+      </w:r>
+      <w:proofErr w:type="spellEnd"/>
+      <w:r>
+        <w:t>:</w:t>
       </w:r>
     </w:p>
     <w:p>
@@ -5628,8 +6000,13 @@
         <w:bidi/>
       </w:pPr>
       <w:r>
-        <w:t xml:space="preserve">      - POSTGRES_DB=authdb</w:t>
-      </w:r>
+        <w:t xml:space="preserve">      - POSTGRES_DB=</w:t>
+      </w:r>
+      <w:proofErr w:type="spellStart"/>
+      <w:r>
+        <w:t>authdb</w:t>
+      </w:r>
+      <w:proofErr w:type="spellEnd"/>
     </w:p>
     <w:p>
       <w:pPr>
@@ -5644,7 +6021,23 @@
         <w:bidi/>
       </w:pPr>
       <w:r>
-        <w:t xml:space="preserve">      - db_data:/var/lib/postgresql/data</w:t>
+        <w:t xml:space="preserve">      - </w:t>
+      </w:r>
+      <w:proofErr w:type="spellStart"/>
+      <w:r>
+        <w:t>db_data</w:t>
+      </w:r>
+      <w:proofErr w:type="spellEnd"/>
+      <w:r>
+        <w:t>:/var/lib/</w:t>
+      </w:r>
+      <w:proofErr w:type="spellStart"/>
+      <w:r>
+        <w:t>postgresql</w:t>
+      </w:r>
+      <w:proofErr w:type="spellEnd"/>
+      <w:r>
+        <w:t>/data</w:t>
       </w:r>
     </w:p>
     <w:p>
@@ -5665,7 +6058,15 @@
         <w:bidi/>
       </w:pPr>
       <w:r>
-        <w:t xml:space="preserve">  db_data:</w:t>
+        <w:t xml:space="preserve">  </w:t>
+      </w:r>
+      <w:proofErr w:type="spellStart"/>
+      <w:r>
+        <w:t>db_data</w:t>
+      </w:r>
+      <w:proofErr w:type="spellEnd"/>
+      <w:r>
+        <w:t>:</w:t>
       </w:r>
     </w:p>
     <w:p>
@@ -5719,6 +6120,7 @@
         </w:numPr>
         <w:bidi/>
       </w:pPr>
+      <w:proofErr w:type="spellStart"/>
       <w:r>
         <w:rPr>
           <w:b/>
@@ -5726,6 +6128,7 @@
         </w:rPr>
         <w:t>Dockerfile</w:t>
       </w:r>
+      <w:proofErr w:type="spellEnd"/>
       <w:r>
         <w:t xml:space="preserve"> = </w:t>
       </w:r>
@@ -5763,8 +6166,17 @@
           <w:b/>
           <w:bCs/>
         </w:rPr>
-        <w:t>docker-compose.yml</w:t>
-      </w:r>
+        <w:t>docker-</w:t>
+      </w:r>
+      <w:proofErr w:type="spellStart"/>
+      <w:r>
+        <w:rPr>
+          <w:b/>
+          <w:bCs/>
+        </w:rPr>
+        <w:t>compose.yml</w:t>
+      </w:r>
+      <w:proofErr w:type="spellEnd"/>
       <w:r>
         <w:t xml:space="preserve"> = </w:t>
       </w:r>
@@ -5850,6 +6262,7 @@
         </w:numPr>
         <w:bidi/>
       </w:pPr>
+      <w:proofErr w:type="spellStart"/>
       <w:r>
         <w:rPr>
           <w:b/>
@@ -5857,6 +6270,7 @@
         </w:rPr>
         <w:t>Dockerfile</w:t>
       </w:r>
+      <w:proofErr w:type="spellEnd"/>
       <w:r>
         <w:t xml:space="preserve"> = </w:t>
       </w:r>
@@ -5890,8 +6304,17 @@
           <w:b/>
           <w:bCs/>
         </w:rPr>
-        <w:t>docker-compose.yml</w:t>
-      </w:r>
+        <w:t>docker-</w:t>
+      </w:r>
+      <w:proofErr w:type="spellStart"/>
+      <w:r>
+        <w:rPr>
+          <w:b/>
+          <w:bCs/>
+        </w:rPr>
+        <w:t>compose.yml</w:t>
+      </w:r>
+      <w:proofErr w:type="spellEnd"/>
       <w:r>
         <w:t xml:space="preserve"> = </w:t>
       </w:r>
@@ -6068,8 +6491,13 @@
         </w:rPr>
         <w:t xml:space="preserve">מתוך </w:t>
       </w:r>
-      <w:r>
-        <w:t xml:space="preserve">Dockerfile </w:t>
+      <w:proofErr w:type="spellStart"/>
+      <w:r>
+        <w:t>Dockerfile</w:t>
+      </w:r>
+      <w:proofErr w:type="spellEnd"/>
+      <w:r>
+        <w:t xml:space="preserve"> </w:t>
       </w:r>
       <w:r>
         <w:rPr>
@@ -6411,8 +6839,13 @@
         </w:rPr>
         <w:t xml:space="preserve">של </w:t>
       </w:r>
-      <w:r>
-        <w:t xml:space="preserve">AuthService, </w:t>
+      <w:proofErr w:type="spellStart"/>
+      <w:r>
+        <w:t>AuthService</w:t>
+      </w:r>
+      <w:proofErr w:type="spellEnd"/>
+      <w:r>
+        <w:t xml:space="preserve">, </w:t>
       </w:r>
       <w:r>
         <w:rPr>
@@ -7076,8 +7509,21 @@
         <w:ind w:left="360"/>
       </w:pPr>
       <w:r>
-        <w:t>context: ./Server/AuthService</w:t>
-      </w:r>
+        <w:t>context</w:t>
+      </w:r>
+      <w:proofErr w:type="gramStart"/>
+      <w:r>
+        <w:t>: .</w:t>
+      </w:r>
+      <w:proofErr w:type="gramEnd"/>
+      <w:r>
+        <w:t>/Server/</w:t>
+      </w:r>
+      <w:proofErr w:type="spellStart"/>
+      <w:r>
+        <w:t>AuthService</w:t>
+      </w:r>
+      <w:proofErr w:type="spellEnd"/>
     </w:p>
     <w:p>
       <w:pPr>
@@ -7096,8 +7542,21 @@
           <w:rtl/>
         </w:rPr>
       </w:pPr>
-      <w:r>
-        <w:t>- ./Server/AuthService:/app</w:t>
+      <w:proofErr w:type="gramStart"/>
+      <w:r>
+        <w:t>- .</w:t>
+      </w:r>
+      <w:proofErr w:type="gramEnd"/>
+      <w:r>
+        <w:t>/Server/</w:t>
+      </w:r>
+      <w:proofErr w:type="spellStart"/>
+      <w:r>
+        <w:t>AuthService</w:t>
+      </w:r>
+      <w:proofErr w:type="spellEnd"/>
+      <w:r>
+        <w:t>:/app</w:t>
       </w:r>
     </w:p>
     <w:p>
@@ -7269,8 +7728,13 @@
           <w:rtl/>
         </w:rPr>
       </w:pPr>
-      <w:r>
-        <w:t xml:space="preserve">Dockerfile </w:t>
+      <w:proofErr w:type="spellStart"/>
+      <w:r>
+        <w:t>Dockerfile</w:t>
+      </w:r>
+      <w:proofErr w:type="spellEnd"/>
+      <w:r>
+        <w:t xml:space="preserve"> </w:t>
       </w:r>
       <w:r>
         <w:rPr>
@@ -8354,7 +8818,27 @@
           <w:szCs w:val="24"/>
           <w14:ligatures w14:val="none"/>
         </w:rPr>
-        <w:t>docker build --build-arg BUILD_CONFIGURATION=Debug.</w:t>
+        <w:t>docker build --build-</w:t>
+      </w:r>
+      <w:proofErr w:type="spellStart"/>
+      <w:r>
+        <w:rPr>
+          <w:rFonts w:ascii="Times New Roman" w:eastAsia="Times New Roman" w:hAnsi="Times New Roman" w:cs="Times New Roman"/>
+          <w:sz w:val="24"/>
+          <w:szCs w:val="24"/>
+          <w14:ligatures w14:val="none"/>
+        </w:rPr>
+        <w:t>arg</w:t>
+      </w:r>
+      <w:proofErr w:type="spellEnd"/>
+      <w:r>
+        <w:rPr>
+          <w:rFonts w:ascii="Times New Roman" w:eastAsia="Times New Roman" w:hAnsi="Times New Roman" w:cs="Times New Roman"/>
+          <w:sz w:val="24"/>
+          <w:szCs w:val="24"/>
+          <w14:ligatures w14:val="none"/>
+        </w:rPr>
+        <w:t xml:space="preserve"> BUILD_CONFIGURATION=Debug.</w:t>
       </w:r>
     </w:p>
     <w:p>
@@ -8375,8 +8859,19 @@
           <w:szCs w:val="24"/>
           <w14:ligatures w14:val="none"/>
         </w:rPr>
-        <w:t>WORKDIR /src</w:t>
-      </w:r>
+        <w:t>WORKDIR /</w:t>
+      </w:r>
+      <w:proofErr w:type="spellStart"/>
+      <w:r>
+        <w:rPr>
+          <w:rFonts w:ascii="Times New Roman" w:eastAsia="Times New Roman" w:hAnsi="Times New Roman" w:cs="Times New Roman"/>
+          <w:sz w:val="24"/>
+          <w:szCs w:val="24"/>
+          <w14:ligatures w14:val="none"/>
+        </w:rPr>
+        <w:t>src</w:t>
+      </w:r>
+      <w:proofErr w:type="spellEnd"/>
     </w:p>
     <w:p>
       <w:pPr>
@@ -8410,7 +8905,27 @@
           <w:szCs w:val="24"/>
           <w14:ligatures w14:val="none"/>
         </w:rPr>
-        <w:t>/src.</w:t>
+        <w:t>/</w:t>
+      </w:r>
+      <w:proofErr w:type="spellStart"/>
+      <w:r>
+        <w:rPr>
+          <w:rFonts w:ascii="Times New Roman" w:eastAsia="Times New Roman" w:hAnsi="Times New Roman" w:cs="Times New Roman"/>
+          <w:sz w:val="24"/>
+          <w:szCs w:val="24"/>
+          <w14:ligatures w14:val="none"/>
+        </w:rPr>
+        <w:t>src</w:t>
+      </w:r>
+      <w:proofErr w:type="spellEnd"/>
+      <w:r>
+        <w:rPr>
+          <w:rFonts w:ascii="Times New Roman" w:eastAsia="Times New Roman" w:hAnsi="Times New Roman" w:cs="Times New Roman"/>
+          <w:sz w:val="24"/>
+          <w:szCs w:val="24"/>
+          <w14:ligatures w14:val="none"/>
+        </w:rPr>
+        <w:t>.</w:t>
       </w:r>
     </w:p>
     <w:p>
@@ -8431,8 +8946,39 @@
           <w:szCs w:val="24"/>
           <w14:ligatures w14:val="none"/>
         </w:rPr>
-        <w:t>RUN dotnet tool list -g | grep dotnet-ef || dotnet tool install --global dotnet-ef</w:t>
-      </w:r>
+        <w:t>RUN dotnet tool list -g | grep dotnet-</w:t>
+      </w:r>
+      <w:proofErr w:type="spellStart"/>
+      <w:r>
+        <w:rPr>
+          <w:rFonts w:ascii="Times New Roman" w:eastAsia="Times New Roman" w:hAnsi="Times New Roman" w:cs="Times New Roman"/>
+          <w:sz w:val="24"/>
+          <w:szCs w:val="24"/>
+          <w14:ligatures w14:val="none"/>
+        </w:rPr>
+        <w:t>ef</w:t>
+      </w:r>
+      <w:proofErr w:type="spellEnd"/>
+      <w:r>
+        <w:rPr>
+          <w:rFonts w:ascii="Times New Roman" w:eastAsia="Times New Roman" w:hAnsi="Times New Roman" w:cs="Times New Roman"/>
+          <w:sz w:val="24"/>
+          <w:szCs w:val="24"/>
+          <w14:ligatures w14:val="none"/>
+        </w:rPr>
+        <w:t xml:space="preserve"> || dotnet tool install --global dotnet-</w:t>
+      </w:r>
+      <w:proofErr w:type="spellStart"/>
+      <w:r>
+        <w:rPr>
+          <w:rFonts w:ascii="Times New Roman" w:eastAsia="Times New Roman" w:hAnsi="Times New Roman" w:cs="Times New Roman"/>
+          <w:sz w:val="24"/>
+          <w:szCs w:val="24"/>
+          <w14:ligatures w14:val="none"/>
+        </w:rPr>
+        <w:t>ef</w:t>
+      </w:r>
+      <w:proofErr w:type="spellEnd"/>
     </w:p>
     <w:p>
       <w:pPr>
@@ -8468,7 +9014,31 @@
           <w:szCs w:val="24"/>
           <w14:ligatures w14:val="none"/>
         </w:rPr>
-        <w:t>Entity Framework CLI (dotnet-ef)</w:t>
+        <w:t>Entity Framework CLI (dotnet-</w:t>
+      </w:r>
+      <w:proofErr w:type="spellStart"/>
+      <w:r>
+        <w:rPr>
+          <w:rFonts w:ascii="Times New Roman" w:eastAsia="Times New Roman" w:hAnsi="Times New Roman" w:cs="Times New Roman"/>
+          <w:b/>
+          <w:bCs/>
+          <w:sz w:val="24"/>
+          <w:szCs w:val="24"/>
+          <w14:ligatures w14:val="none"/>
+        </w:rPr>
+        <w:t>ef</w:t>
+      </w:r>
+      <w:proofErr w:type="spellEnd"/>
+      <w:r>
+        <w:rPr>
+          <w:rFonts w:ascii="Times New Roman" w:eastAsia="Times New Roman" w:hAnsi="Times New Roman" w:cs="Times New Roman"/>
+          <w:b/>
+          <w:bCs/>
+          <w:sz w:val="24"/>
+          <w:szCs w:val="24"/>
+          <w14:ligatures w14:val="none"/>
+        </w:rPr>
+        <w:t>)</w:t>
       </w:r>
       <w:r>
         <w:rPr>
@@ -8625,7 +9195,27 @@
           <w:szCs w:val="24"/>
           <w14:ligatures w14:val="none"/>
         </w:rPr>
-        <w:t xml:space="preserve">dotnet-ef </w:t>
+        <w:t>dotnet-</w:t>
+      </w:r>
+      <w:proofErr w:type="spellStart"/>
+      <w:r>
+        <w:rPr>
+          <w:rFonts w:ascii="Times New Roman" w:eastAsia="Times New Roman" w:hAnsi="Times New Roman" w:cs="Times New Roman"/>
+          <w:sz w:val="24"/>
+          <w:szCs w:val="24"/>
+          <w14:ligatures w14:val="none"/>
+        </w:rPr>
+        <w:t>ef</w:t>
+      </w:r>
+      <w:proofErr w:type="spellEnd"/>
+      <w:r>
+        <w:rPr>
+          <w:rFonts w:ascii="Times New Roman" w:eastAsia="Times New Roman" w:hAnsi="Times New Roman" w:cs="Times New Roman"/>
+          <w:sz w:val="24"/>
+          <w:szCs w:val="24"/>
+          <w14:ligatures w14:val="none"/>
+        </w:rPr>
+        <w:t xml:space="preserve"> </w:t>
       </w:r>
       <w:r>
         <w:rPr>
@@ -8665,7 +9255,27 @@
           <w:szCs w:val="24"/>
           <w14:ligatures w14:val="none"/>
         </w:rPr>
-        <w:t>COPY ["AuthService.csproj", "."]</w:t>
+        <w:t>COPY ["</w:t>
+      </w:r>
+      <w:proofErr w:type="spellStart"/>
+      <w:r>
+        <w:rPr>
+          <w:rFonts w:ascii="Times New Roman" w:eastAsia="Times New Roman" w:hAnsi="Times New Roman" w:cs="Times New Roman"/>
+          <w:sz w:val="24"/>
+          <w:szCs w:val="24"/>
+          <w14:ligatures w14:val="none"/>
+        </w:rPr>
+        <w:t>AuthService.csproj</w:t>
+      </w:r>
+      <w:proofErr w:type="spellEnd"/>
+      <w:r>
+        <w:rPr>
+          <w:rFonts w:ascii="Times New Roman" w:eastAsia="Times New Roman" w:hAnsi="Times New Roman" w:cs="Times New Roman"/>
+          <w:sz w:val="24"/>
+          <w:szCs w:val="24"/>
+          <w14:ligatures w14:val="none"/>
+        </w:rPr>
+        <w:t>", "."]</w:t>
       </w:r>
     </w:p>
     <w:p>
@@ -8693,6 +9303,7 @@
         </w:rPr>
         <w:t>מעתיק את קובץ ה־</w:t>
       </w:r>
+      <w:proofErr w:type="spellStart"/>
       <w:r>
         <w:rPr>
           <w:rFonts w:ascii="Times New Roman" w:eastAsia="Times New Roman" w:hAnsi="Times New Roman" w:cs="Times New Roman"/>
@@ -8704,6 +9315,7 @@
         </w:rPr>
         <w:t>csproj</w:t>
       </w:r>
+      <w:proofErr w:type="spellEnd"/>
       <w:r>
         <w:rPr>
           <w:rFonts w:ascii="Times New Roman" w:eastAsia="Times New Roman" w:hAnsi="Times New Roman" w:cs="Times New Roman"/>
@@ -8730,7 +9342,27 @@
           <w:szCs w:val="24"/>
           <w14:ligatures w14:val="none"/>
         </w:rPr>
-        <w:t>/src).</w:t>
+        <w:t>/</w:t>
+      </w:r>
+      <w:proofErr w:type="spellStart"/>
+      <w:r>
+        <w:rPr>
+          <w:rFonts w:ascii="Times New Roman" w:eastAsia="Times New Roman" w:hAnsi="Times New Roman" w:cs="Times New Roman"/>
+          <w:sz w:val="24"/>
+          <w:szCs w:val="24"/>
+          <w14:ligatures w14:val="none"/>
+        </w:rPr>
+        <w:t>src</w:t>
+      </w:r>
+      <w:proofErr w:type="spellEnd"/>
+      <w:r>
+        <w:rPr>
+          <w:rFonts w:ascii="Times New Roman" w:eastAsia="Times New Roman" w:hAnsi="Times New Roman" w:cs="Times New Roman"/>
+          <w:sz w:val="24"/>
+          <w:szCs w:val="24"/>
+          <w14:ligatures w14:val="none"/>
+        </w:rPr>
+        <w:t>).</w:t>
       </w:r>
     </w:p>
     <w:p>
@@ -8843,7 +9475,27 @@
           <w:szCs w:val="24"/>
           <w14:ligatures w14:val="none"/>
         </w:rPr>
-        <w:t>RUN dotnet restore "./AuthService.csproj"</w:t>
+        <w:t>RUN dotnet restore "./</w:t>
+      </w:r>
+      <w:proofErr w:type="spellStart"/>
+      <w:r>
+        <w:rPr>
+          <w:rFonts w:ascii="Times New Roman" w:eastAsia="Times New Roman" w:hAnsi="Times New Roman" w:cs="Times New Roman"/>
+          <w:sz w:val="24"/>
+          <w:szCs w:val="24"/>
+          <w14:ligatures w14:val="none"/>
+        </w:rPr>
+        <w:t>AuthService.csproj</w:t>
+      </w:r>
+      <w:proofErr w:type="spellEnd"/>
+      <w:r>
+        <w:rPr>
+          <w:rFonts w:ascii="Times New Roman" w:eastAsia="Times New Roman" w:hAnsi="Times New Roman" w:cs="Times New Roman"/>
+          <w:sz w:val="24"/>
+          <w:szCs w:val="24"/>
+          <w14:ligatures w14:val="none"/>
+        </w:rPr>
+        <w:t>"</w:t>
       </w:r>
     </w:p>
     <w:p>
@@ -8890,14 +9542,25 @@
         </w:rPr>
         <w:t xml:space="preserve">שהפרויקט צריך (כמו </w:t>
       </w:r>
-      <w:r>
-        <w:rPr>
-          <w:rFonts w:ascii="Times New Roman" w:eastAsia="Times New Roman" w:hAnsi="Times New Roman" w:cs="Times New Roman"/>
-          <w:sz w:val="24"/>
-          <w:szCs w:val="24"/>
-          <w14:ligatures w14:val="none"/>
-        </w:rPr>
-        <w:t xml:space="preserve">npm install </w:t>
+      <w:proofErr w:type="spellStart"/>
+      <w:r>
+        <w:rPr>
+          <w:rFonts w:ascii="Times New Roman" w:eastAsia="Times New Roman" w:hAnsi="Times New Roman" w:cs="Times New Roman"/>
+          <w:sz w:val="24"/>
+          <w:szCs w:val="24"/>
+          <w14:ligatures w14:val="none"/>
+        </w:rPr>
+        <w:t>npm</w:t>
+      </w:r>
+      <w:proofErr w:type="spellEnd"/>
+      <w:r>
+        <w:rPr>
+          <w:rFonts w:ascii="Times New Roman" w:eastAsia="Times New Roman" w:hAnsi="Times New Roman" w:cs="Times New Roman"/>
+          <w:sz w:val="24"/>
+          <w:szCs w:val="24"/>
+          <w14:ligatures w14:val="none"/>
+        </w:rPr>
+        <w:t xml:space="preserve"> install </w:t>
       </w:r>
       <w:r>
         <w:rPr>
@@ -8930,6 +9593,7 @@
           <w14:ligatures w14:val="none"/>
         </w:rPr>
       </w:pPr>
+      <w:proofErr w:type="gramStart"/>
       <w:r>
         <w:rPr>
           <w:rFonts w:ascii="Times New Roman" w:eastAsia="Times New Roman" w:hAnsi="Times New Roman" w:cs="Times New Roman"/>
@@ -8938,7 +9602,17 @@
           <w14:ligatures w14:val="none"/>
         </w:rPr>
         <w:lastRenderedPageBreak/>
-        <w:t>COPY . .</w:t>
+        <w:t>COPY .</w:t>
+      </w:r>
+      <w:proofErr w:type="gramEnd"/>
+      <w:r>
+        <w:rPr>
+          <w:rFonts w:ascii="Times New Roman" w:eastAsia="Times New Roman" w:hAnsi="Times New Roman" w:cs="Times New Roman"/>
+          <w:sz w:val="24"/>
+          <w:szCs w:val="24"/>
+          <w14:ligatures w14:val="none"/>
+        </w:rPr>
+        <w:t xml:space="preserve"> .</w:t>
       </w:r>
     </w:p>
     <w:p>
@@ -8994,7 +9668,27 @@
           <w:szCs w:val="24"/>
           <w14:ligatures w14:val="none"/>
         </w:rPr>
-        <w:t>RUN dotnet build "./AuthService.csproj" -c $BUILD_CONFIGURATION -o /app/build</w:t>
+        <w:t>RUN dotnet build "./</w:t>
+      </w:r>
+      <w:proofErr w:type="spellStart"/>
+      <w:r>
+        <w:rPr>
+          <w:rFonts w:ascii="Times New Roman" w:eastAsia="Times New Roman" w:hAnsi="Times New Roman" w:cs="Times New Roman"/>
+          <w:sz w:val="24"/>
+          <w:szCs w:val="24"/>
+          <w14:ligatures w14:val="none"/>
+        </w:rPr>
+        <w:t>AuthService.csproj</w:t>
+      </w:r>
+      <w:proofErr w:type="spellEnd"/>
+      <w:r>
+        <w:rPr>
+          <w:rFonts w:ascii="Times New Roman" w:eastAsia="Times New Roman" w:hAnsi="Times New Roman" w:cs="Times New Roman"/>
+          <w:sz w:val="24"/>
+          <w:szCs w:val="24"/>
+          <w14:ligatures w14:val="none"/>
+        </w:rPr>
+        <w:t>" -c $BUILD_CONFIGURATION -o /app/build</w:t>
       </w:r>
     </w:p>
     <w:p>
@@ -9301,7 +9995,49 @@
           <w:szCs w:val="24"/>
           <w14:ligatures w14:val="none"/>
         </w:rPr>
-        <w:t>RUN dotnet publish "./AuthService.csproj" -c $BUILD_CONFIGURATION -o /app/publish /p:UseAppHost=false</w:t>
+        <w:t>RUN dotnet publish "./</w:t>
+      </w:r>
+      <w:proofErr w:type="spellStart"/>
+      <w:r>
+        <w:rPr>
+          <w:rFonts w:ascii="Times New Roman" w:eastAsia="Times New Roman" w:hAnsi="Times New Roman" w:cs="Times New Roman"/>
+          <w:sz w:val="24"/>
+          <w:szCs w:val="24"/>
+          <w14:ligatures w14:val="none"/>
+        </w:rPr>
+        <w:t>AuthService.csproj</w:t>
+      </w:r>
+      <w:proofErr w:type="spellEnd"/>
+      <w:r>
+        <w:rPr>
+          <w:rFonts w:ascii="Times New Roman" w:eastAsia="Times New Roman" w:hAnsi="Times New Roman" w:cs="Times New Roman"/>
+          <w:sz w:val="24"/>
+          <w:szCs w:val="24"/>
+          <w14:ligatures w14:val="none"/>
+        </w:rPr>
+        <w:t>" -c $BUILD_CONFIGURATION -o /app/publish /</w:t>
+      </w:r>
+      <w:proofErr w:type="spellStart"/>
+      <w:proofErr w:type="gramStart"/>
+      <w:r>
+        <w:rPr>
+          <w:rFonts w:ascii="Times New Roman" w:eastAsia="Times New Roman" w:hAnsi="Times New Roman" w:cs="Times New Roman"/>
+          <w:sz w:val="24"/>
+          <w:szCs w:val="24"/>
+          <w14:ligatures w14:val="none"/>
+        </w:rPr>
+        <w:t>p:UseAppHost</w:t>
+      </w:r>
+      <w:proofErr w:type="spellEnd"/>
+      <w:proofErr w:type="gramEnd"/>
+      <w:r>
+        <w:rPr>
+          <w:rFonts w:ascii="Times New Roman" w:eastAsia="Times New Roman" w:hAnsi="Times New Roman" w:cs="Times New Roman"/>
+          <w:sz w:val="24"/>
+          <w:szCs w:val="24"/>
+          <w14:ligatures w14:val="none"/>
+        </w:rPr>
+        <w:t>=false</w:t>
       </w:r>
     </w:p>
     <w:p>
@@ -9443,7 +10179,29 @@
           <w:szCs w:val="24"/>
           <w14:ligatures w14:val="none"/>
         </w:rPr>
-        <w:t xml:space="preserve">/p:UseAppHost=false → </w:t>
+        <w:t>/</w:t>
+      </w:r>
+      <w:proofErr w:type="spellStart"/>
+      <w:proofErr w:type="gramStart"/>
+      <w:r>
+        <w:rPr>
+          <w:rFonts w:ascii="Times New Roman" w:eastAsia="Times New Roman" w:hAnsi="Times New Roman" w:cs="Times New Roman"/>
+          <w:sz w:val="24"/>
+          <w:szCs w:val="24"/>
+          <w14:ligatures w14:val="none"/>
+        </w:rPr>
+        <w:t>p:UseAppHost</w:t>
+      </w:r>
+      <w:proofErr w:type="spellEnd"/>
+      <w:proofErr w:type="gramEnd"/>
+      <w:r>
+        <w:rPr>
+          <w:rFonts w:ascii="Times New Roman" w:eastAsia="Times New Roman" w:hAnsi="Times New Roman" w:cs="Times New Roman"/>
+          <w:sz w:val="24"/>
+          <w:szCs w:val="24"/>
+          <w14:ligatures w14:val="none"/>
+        </w:rPr>
+        <w:t xml:space="preserve">=false → </w:t>
       </w:r>
       <w:r>
         <w:rPr>
@@ -9723,8 +10481,19 @@
           <w:szCs w:val="24"/>
           <w14:ligatures w14:val="none"/>
         </w:rPr>
-        <w:t>COPY --from=publish /app/publish .</w:t>
-      </w:r>
+        <w:t>COPY --from=publish /app/</w:t>
+      </w:r>
+      <w:proofErr w:type="gramStart"/>
+      <w:r>
+        <w:rPr>
+          <w:rFonts w:ascii="Times New Roman" w:eastAsia="Times New Roman" w:hAnsi="Times New Roman" w:cs="Times New Roman"/>
+          <w:sz w:val="24"/>
+          <w:szCs w:val="24"/>
+          <w14:ligatures w14:val="none"/>
+        </w:rPr>
+        <w:t>publish .</w:t>
+      </w:r>
+      <w:proofErr w:type="gramEnd"/>
     </w:p>
     <w:p>
       <w:pPr>
@@ -10397,7 +11166,215 @@
         <w:rPr>
           <w:rFonts w:hint="cs"/>
           <w:rtl/>
-        </w:rPr>
+          <w:lang w:val="en-US"/>
+        </w:rPr>
+        <w:t xml:space="preserve">הרצת פקודות מיתוך ה </w:t>
+      </w:r>
+      <w:r>
+        <w:rPr>
+          <w:rFonts w:hint="eastAsia"/>
+          <w:lang w:val="en-US"/>
+        </w:rPr>
+        <w:t>Shell</w:t>
+      </w:r>
+      <w:r>
+        <w:rPr>
+          <w:lang w:val="en-GB"/>
+        </w:rPr>
+        <w:t xml:space="preserve"> </w:t>
+      </w:r>
+      <w:r>
+        <w:rPr>
+          <w:rFonts w:hint="cs"/>
+          <w:rtl/>
+          <w:lang w:val="en-IL"/>
+        </w:rPr>
+        <w:t xml:space="preserve"> בדוקר קונטיינר:</w:t>
+      </w:r>
+    </w:p>
+    <w:p>
+      <w:pPr>
+        <w:bidi/>
+        <w:ind w:left="360"/>
+        <w:rPr>
+          <w:rFonts w:hint="cs"/>
+          <w:rtl/>
+          <w:lang w:val="en-IL"/>
+        </w:rPr>
+      </w:pPr>
+      <w:r>
+        <w:rPr>
+          <w:rFonts w:hint="cs"/>
+          <w:rtl/>
+          <w:lang w:val="en-US"/>
+        </w:rPr>
+        <w:t xml:space="preserve">מריצים את ה </w:t>
+      </w:r>
+      <w:r>
+        <w:rPr>
+          <w:rFonts w:hint="eastAsia"/>
+          <w:lang w:val="en-US"/>
+        </w:rPr>
+        <w:t xml:space="preserve">Command shell </w:t>
+      </w:r>
+      <w:r>
+        <w:rPr>
+          <w:rFonts w:hint="cs"/>
+          <w:rtl/>
+          <w:lang w:val="en-IL"/>
+        </w:rPr>
+        <w:t xml:space="preserve"> או </w:t>
+      </w:r>
+      <w:r>
+        <w:rPr>
+          <w:lang w:val="en-IL"/>
+        </w:rPr>
+        <w:t>CMD</w:t>
+      </w:r>
+      <w:r>
+        <w:rPr>
+          <w:rFonts w:hint="cs"/>
+          <w:rtl/>
+          <w:lang w:val="en-IL"/>
+        </w:rPr>
+        <w:t xml:space="preserve"> ומקלידים את הפקודה הבאה:</w:t>
+      </w:r>
+    </w:p>
+    <w:p>
+      <w:pPr>
+        <w:rPr>
+          <w:rtl/>
+          <w:lang w:val="en-US"/>
+        </w:rPr>
+      </w:pPr>
+      <w:r>
+        <w:rPr>
+          <w:lang w:val="en-US"/>
+        </w:rPr>
+        <w:t xml:space="preserve">docker exec -it a2c_db </w:t>
+      </w:r>
+      <w:proofErr w:type="spellStart"/>
+      <w:r>
+        <w:rPr>
+          <w:lang w:val="en-US"/>
+        </w:rPr>
+        <w:t>sh</w:t>
+      </w:r>
+      <w:proofErr w:type="spellEnd"/>
+      <w:r>
+        <w:rPr>
+          <w:rtl/>
+          <w:lang w:val="en-US"/>
+        </w:rPr>
+        <w:tab/>
+      </w:r>
+      <w:r>
+        <w:rPr>
+          <w:rFonts w:hint="cs"/>
+          <w:rtl/>
+          <w:lang w:val="en-US"/>
+        </w:rPr>
+        <w:t>למשל חיבור לקונטיינר של הדטאבייס</w:t>
+      </w:r>
+    </w:p>
+    <w:p>
+      <w:pPr>
+        <w:rPr>
+          <w:rFonts w:hint="eastAsia"/>
+          <w:lang w:val="en-US"/>
+        </w:rPr>
+      </w:pPr>
+      <w:proofErr w:type="spellStart"/>
+      <w:r>
+        <w:rPr>
+          <w:lang w:val="en-US"/>
+        </w:rPr>
+        <w:t>psql</w:t>
+      </w:r>
+      <w:proofErr w:type="spellEnd"/>
+      <w:r>
+        <w:rPr>
+          <w:lang w:val="en-US"/>
+        </w:rPr>
+        <w:t xml:space="preserve"> -U </w:t>
+      </w:r>
+      <w:proofErr w:type="spellStart"/>
+      <w:r>
+        <w:rPr>
+          <w:lang w:val="en-US"/>
+        </w:rPr>
+        <w:t>postgres</w:t>
+      </w:r>
+      <w:proofErr w:type="spellEnd"/>
+      <w:r>
+        <w:rPr>
+          <w:lang w:val="en-US"/>
+        </w:rPr>
+        <w:t xml:space="preserve"> -d a2cdb</w:t>
+      </w:r>
+      <w:r>
+        <w:rPr>
+          <w:rtl/>
+          <w:lang w:val="en-US"/>
+        </w:rPr>
+        <w:tab/>
+      </w:r>
+      <w:r>
+        <w:rPr>
+          <w:rtl/>
+          <w:lang w:val="en-US"/>
+        </w:rPr>
+        <w:tab/>
+      </w:r>
+      <w:r>
+        <w:rPr>
+          <w:rFonts w:hint="eastAsia"/>
+          <w:lang w:val="en-US"/>
+        </w:rPr>
+        <w:t xml:space="preserve">SQL </w:t>
+      </w:r>
+      <w:r>
+        <w:rPr>
+          <w:rFonts w:hint="cs"/>
+          <w:rtl/>
+          <w:lang w:val="en-US"/>
+        </w:rPr>
+        <w:t xml:space="preserve">אחרי כניסה לקונטיינר מריצים פקודת </w:t>
+      </w:r>
+      <w:r>
+        <w:rPr>
+          <w:rFonts w:hint="eastAsia"/>
+          <w:lang w:val="en-US"/>
+        </w:rPr>
+        <w:t xml:space="preserve"> </w:t>
+      </w:r>
+    </w:p>
+    <w:p>
+      <w:pPr>
+        <w:rPr>
+          <w:lang w:val="en-US"/>
+        </w:rPr>
+      </w:pPr>
+    </w:p>
+    <w:p>
+      <w:pPr>
+        <w:pStyle w:val="Heading1"/>
+        <w:numPr>
+          <w:ilvl w:val="0"/>
+          <w:numId w:val="8"/>
+        </w:numPr>
+        <w:bidi/>
+        <w:rPr>
+          <w:rtl/>
+          <w:lang w:val="en-US"/>
+        </w:rPr>
+      </w:pPr>
+      <w:r>
+        <w:rPr>
+          <w:rFonts w:hint="cs"/>
+          <w:rtl/>
+        </w:rPr>
+        <w:lastRenderedPageBreak/>
         <w:t xml:space="preserve">התקנת סביבת </w:t>
       </w:r>
       <w:r>
@@ -10506,14 +11483,45 @@
           <w14:ligatures w14:val="none"/>
         </w:rPr>
       </w:pPr>
-      <w:r>
-        <w:rPr>
-          <w:rFonts w:ascii="Times New Roman" w:eastAsia="Times New Roman" w:hAnsi="Times New Roman" w:cs="Times New Roman"/>
-          <w:sz w:val="24"/>
-          <w:szCs w:val="24"/>
-          <w14:ligatures w14:val="none"/>
-        </w:rPr>
-        <w:t>npx create-react-app . --template typescript</w:t>
+      <w:proofErr w:type="spellStart"/>
+      <w:r>
+        <w:rPr>
+          <w:rFonts w:ascii="Times New Roman" w:eastAsia="Times New Roman" w:hAnsi="Times New Roman" w:cs="Times New Roman"/>
+          <w:sz w:val="24"/>
+          <w:szCs w:val="24"/>
+          <w14:ligatures w14:val="none"/>
+        </w:rPr>
+        <w:t>npx</w:t>
+      </w:r>
+      <w:proofErr w:type="spellEnd"/>
+      <w:r>
+        <w:rPr>
+          <w:rFonts w:ascii="Times New Roman" w:eastAsia="Times New Roman" w:hAnsi="Times New Roman" w:cs="Times New Roman"/>
+          <w:sz w:val="24"/>
+          <w:szCs w:val="24"/>
+          <w14:ligatures w14:val="none"/>
+        </w:rPr>
+        <w:t xml:space="preserve"> create-react-</w:t>
+      </w:r>
+      <w:proofErr w:type="gramStart"/>
+      <w:r>
+        <w:rPr>
+          <w:rFonts w:ascii="Times New Roman" w:eastAsia="Times New Roman" w:hAnsi="Times New Roman" w:cs="Times New Roman"/>
+          <w:sz w:val="24"/>
+          <w:szCs w:val="24"/>
+          <w14:ligatures w14:val="none"/>
+        </w:rPr>
+        <w:t>app .</w:t>
+      </w:r>
+      <w:proofErr w:type="gramEnd"/>
+      <w:r>
+        <w:rPr>
+          <w:rFonts w:ascii="Times New Roman" w:eastAsia="Times New Roman" w:hAnsi="Times New Roman" w:cs="Times New Roman"/>
+          <w:sz w:val="24"/>
+          <w:szCs w:val="24"/>
+          <w14:ligatures w14:val="none"/>
+        </w:rPr>
+        <w:t xml:space="preserve"> --template typescript</w:t>
       </w:r>
     </w:p>
     <w:p>
@@ -10549,7 +11557,6 @@
           <w:rtl/>
           <w14:ligatures w14:val="none"/>
         </w:rPr>
-        <w:lastRenderedPageBreak/>
         <w:t xml:space="preserve">קיצורי מקשים ב </w:t>
       </w:r>
       <w:r>
@@ -10598,7 +11605,7 @@
                     <pic:cNvPicPr/>
                   </pic:nvPicPr>
                   <pic:blipFill>
-                    <a:blip r:embed="rId7"/>
+                    <a:blip r:embed="rId8"/>
                     <a:stretch>
                       <a:fillRect/>
                     </a:stretch>
@@ -16789,4 +17796,16 @@
     </a:ext>
   </a:extLst>
 </a:theme>
+</file>
+
+<file path=customXml/item1.xml><?xml version="1.0" encoding="utf-8"?>
+<b:Sources xmlns:b="http://schemas.openxmlformats.org/officeDocument/2006/bibliography" xmlns="http://schemas.openxmlformats.org/officeDocument/2006/bibliography" SelectedStyle="\APASixthEditionOfficeOnline.xsl" StyleName="APA" Version="6"/>
+</file>
+
+<file path=customXml/itemProps1.xml><?xml version="1.0" encoding="utf-8"?>
+<ds:datastoreItem xmlns:ds="http://schemas.openxmlformats.org/officeDocument/2006/customXml" ds:itemID="{A893F76D-1B0D-47C5-94CE-96C9CCDCE025}">
+  <ds:schemaRefs>
+    <ds:schemaRef ds:uri="http://schemas.openxmlformats.org/officeDocument/2006/bibliography"/>
+  </ds:schemaRefs>
+</ds:datastoreItem>
 </file>
</xml_diff>